<commit_message>
Revise paper with selected references
Co-authored-by: LYX100 <LYX100@users.noreply.github.com>
</commit_message>
<xml_diff>
--- a/陈水桓25级法律（法学）25020070121刑事诉讼法结课论文.docx
+++ b/陈水桓25级法律（法学）25020070121刑事诉讼法结课论文.docx
@@ -236,7 +236,7 @@
           <w:szCs w:val="24"/>
           <w:rFonts w:eastAsia="宋体" w:ascii="Times New Roman" w:hAnsi="Times New Roman"/>
         </w:rPr>
-        <w:t xml:space="preserve">从所阅读的二十八篇刑事诉讼法文献看，学界近年来对刑事管辖制度的讨论集中在几个问题上：第一，指定管辖、集中管辖、并案管辖和移送管辖等例外性机制不断扩张，冲击了普通法定管辖的稳定性；第二，侦查指定管辖、监察调查指定管辖常常对后续审查起诉和审判形成事实上的预决效力，与“以审判为中心”的改革目标存在张力；第三，被追诉人及其辩护人虽然在实践中经常提出管辖异议，但刑事诉讼法尚未将其明确塑造为一项程序性权利；第四，检察监督、法院审查、程序性制裁等配套机制不足，使管辖违法难以及时纠正。</w:t>
+        <w:t xml:space="preserve">从所阅读的二十八篇刑事诉讼法文献看，学界近年来对刑事管辖制度的讨论集中在几个问题上：第一，指定管辖、集中管辖、并案管辖和移送管辖等例外性机制不断扩张，冲击了普通法定管辖的稳定性；第二，侦查指定管辖、监察调查指定管辖常常对后续审查起诉和审判形成事实上的预决效力，与“以审判为中心”的改革目标存在张力；第三，被追诉人及其辩护人虽然在实践中经常提出管辖异议，但刑事诉讼法尚未将其明确塑造为一项程序性权利；第四，检察监督、法院审查、程序性制裁等配套机制不足，使管辖违法难以及时纠正。为避免参考文献堆砌，本文并不机械列举全部阅读材料，而是选取与论题关系最密切、能够支撑主要论证的代表性文献加以引用。</w:t>
       </w:r>
     </w:p>
     <w:p>
@@ -365,7 +365,7 @@
           <w:szCs w:val="24"/>
           <w:rFonts w:eastAsia="宋体" w:ascii="Times New Roman" w:hAnsi="Times New Roman"/>
         </w:rPr>
-        <w:t xml:space="preserve">俞育标、卢文等文献均承认，指定管辖作为法定管辖的补充，在排除地方干扰、实现办案机关整体回避、整合司法资源等方面有现实必要。[3][16] 张培铮对公安机关侦查指定管辖的研究也说明，在管辖权竞合、限期破案压力和社会舆论压力共同作用下，侦查机关确有通过上级指定来明确管辖的需求。[4] 监察调查领域的文献同样指出，重大职务犯罪案件中适用指定管辖，有助于维护被调查人的审级利益、调配办案力量并防止地方关系网影响案件处理。[9][10]</w:t>
+        <w:t xml:space="preserve">相关文献普遍承认，指定管辖作为法定管辖的补充，在排除地方干扰、实现办案机关整体回避、整合司法资源等方面有现实必要。张培铮对公安机关侦查指定管辖的研究说明，在管辖权竞合、限期破案压力和社会舆论压力共同作用下，侦查机关确有通过上级指定来明确管辖的需求。[5] 监察调查领域的研究同样指出，重大职务犯罪案件中适用指定管辖，有助于维护被调查人的审级利益、调配办案力量并防止地方关系网影响案件处理。[6][7]</w:t>
       </w:r>
     </w:p>
     <w:p>
@@ -408,21 +408,21 @@
           <w:szCs w:val="24"/>
           <w:rFonts w:eastAsia="宋体" w:ascii="Times New Roman" w:hAnsi="Times New Roman"/>
         </w:rPr>
-        <w:t xml:space="preserve">多篇文献共同指出，当前刑事指定管辖的主要风险是例外机制常态化。侦查阶段，郭烁、吴子越将侦查指定管辖概括为从“工具导向”向“权利本位”转型的问题，认为现有制度存在适用条件不明确、适用次数无限制和监督制约机制缺失等现象。[5] 洪刚也指出，指定侦查管辖在实践中可能出现程序启动职权化、指定结果预设化和侦查中心主义强化等偏差。[6] 在涉企经济犯罪中，郭烁和蔡元培都注意到“远洋捕捞”式趋利性执法，其背后既有罚没收入和考核因素，也有管辖连接点过度扩张、移送管辖失灵等制度原因。[7][8]</w:t>
-      </w:r>
-    </w:p>
-    <w:p>
-      <w:pPr>
-        <w:ind w:firstLineChars="200"/>
-        <w:spacing w:after="120" w:line="360" w:lineRule="auto"/>
-      </w:pPr>
-      <w:r>
-        <w:rPr>
-          <w:sz w:val="24"/>
-          <w:szCs w:val="24"/>
-          <w:rFonts w:eastAsia="宋体" w:ascii="Times New Roman" w:hAnsi="Times New Roman"/>
-        </w:rPr>
-        <w:t xml:space="preserve">监察领域的问题更为典型。卢少锋、秦景琦统计的样本显示，在47份具有监察机关指定管辖情形的职务犯罪判决书中，有41份由被指定的监察机关移送本地同级检察机关，占87%。[9] 陈修勇关于2018年至2023年最高检通报样本的研究也表明，职务犯罪案件中指定管辖已经高度普遍。[12] 这说明监察调查指定管辖并不只是决定“由哪个监察机关调查”，而是在相当程度上影响“由哪个检察院起诉、由哪个法院审判”。当监察管辖以干部管理权限为核心，而刑事诉讼级别管辖以案件性质和可能刑罚为核心时，二者如果缺少衔接规则，就会出现“大官小案”被不必要地提到较高级别机关处理，或者“小官大案”没有及时进入应有级别程序的问题。</w:t>
+        <w:t xml:space="preserve">多篇文献共同指出，当前刑事指定管辖的主要风险是例外机制常态化。侦查阶段，郭烁、吴子越将侦查指定管辖概括为从“工具导向”向“权利本位”转型的问题，认为现有制度存在适用条件不明确、适用次数无限制和监督制约机制缺失等现象。[3] 在涉企经济犯罪中，蔡元培特别注意到“远洋捕捞”式趋利性执法，其背后既有罚没收入和考核因素，也有管辖连接点过度扩张、移送管辖失灵等制度原因。[4]</w:t>
+      </w:r>
+    </w:p>
+    <w:p>
+      <w:pPr>
+        <w:ind w:firstLineChars="200"/>
+        <w:spacing w:after="120" w:line="360" w:lineRule="auto"/>
+      </w:pPr>
+      <w:r>
+        <w:rPr>
+          <w:sz w:val="24"/>
+          <w:szCs w:val="24"/>
+          <w:rFonts w:eastAsia="宋体" w:ascii="Times New Roman" w:hAnsi="Times New Roman"/>
+        </w:rPr>
+        <w:t xml:space="preserve">监察领域的问题更为典型。卢少锋、秦景琦统计的样本显示，在47份具有监察机关指定管辖情形的职务犯罪判决书中，有41份由被指定的监察机关移送本地同级检察机关，占87%。[6] 陈修勇关于2018年至2023年最高检通报样本的研究也表明，职务犯罪案件中指定管辖已经高度普遍。[8] 这说明监察调查指定管辖并不只是决定“由哪个监察机关调查”，而是在相当程度上影响“由哪个检察院起诉、由哪个法院审判”。当监察管辖以干部管理权限为核心，而刑事诉讼级别管辖以案件性质和可能刑罚为核心时，二者如果缺少衔接规则，就会出现“大官小案”被不必要地提到较高级别机关处理，或者“小官大案”没有及时进入应有级别程序的问题。</w:t>
       </w:r>
     </w:p>
     <w:p>
@@ -480,35 +480,35 @@
           <w:szCs w:val="24"/>
           <w:rFonts w:eastAsia="宋体" w:ascii="Times New Roman" w:hAnsi="Times New Roman"/>
         </w:rPr>
-        <w:t xml:space="preserve">目前刑事诉讼法对指定管辖的直接规定主要集中在审判阶段，而大量侦查指定管辖、审查起诉管辖衔接、监察调查指定管辖等问题，则分散规定在部门规章、司法解释、监察法规和规范性文件中。规范层级越低，越容易出现制度创设与基本法律脱节的问题。张培铮指出，公安机关侦查指定管辖主要依赖《公安机关办理刑事案件程序规定》等文件，存在上位法依据不足、授权条款性质不清和与立案、逮捕、起诉衔接不畅等问题。[4]</w:t>
-      </w:r>
-    </w:p>
-    <w:p>
-      <w:pPr>
-        <w:ind w:firstLineChars="200"/>
-        <w:spacing w:after="120" w:line="360" w:lineRule="auto"/>
-      </w:pPr>
-      <w:r>
-        <w:rPr>
-          <w:sz w:val="24"/>
-          <w:szCs w:val="24"/>
-          <w:rFonts w:eastAsia="宋体" w:ascii="Times New Roman" w:hAnsi="Times New Roman"/>
-        </w:rPr>
-        <w:t xml:space="preserve">适用条件模糊是另一突出问题。实践中常见的表述包括“管辖不明”“有争议”“情况特殊”“更为适宜”“有必要”等。这些概念有保留弹性的必要，但如果没有列举式事由、限制性解释和书面说理，就很难防止自由裁量扩大。比如，何谓“特殊原因”？是地方保护、机关整体回避，还是社会舆论、办案便利、领导重视？杨迪菲等关于“特殊原因”指定管辖适用范围扩张的研究虽以民事诉讼为对象，但其提醒同样适用于刑事诉讼：如果特殊原因可以不断扩张，指定管辖就可能架空回避制度和法定管辖秩序。[25]</w:t>
-      </w:r>
-    </w:p>
-    <w:p>
-      <w:pPr>
-        <w:ind w:firstLineChars="200"/>
-        <w:spacing w:after="120" w:line="360" w:lineRule="auto"/>
-      </w:pPr>
-      <w:r>
-        <w:rPr>
-          <w:sz w:val="24"/>
-          <w:szCs w:val="24"/>
-          <w:rFonts w:eastAsia="宋体" w:ascii="Times New Roman" w:hAnsi="Times New Roman"/>
-        </w:rPr>
-        <w:t xml:space="preserve">指定管辖的决定主体、决定时间、指定次数和文书形式也不够明确。郭烁、吴子越提到，侦查指定管辖适用次数无限制，可能与指定居所监视居住等强制措施结合，造成对犯罪嫌疑人人身自由的不当限制。[5] 卢少锋、秦景琦也主张监察指定管辖应以一次为原则，并以决定书形式送达、通知被调查人。[9] 这些建议背后，都是对程序安定性的重视。</w:t>
+        <w:t xml:space="preserve">目前刑事诉讼法对指定管辖的直接规定主要集中在审判阶段，而大量侦查指定管辖、审查起诉管辖衔接、监察调查指定管辖等问题，则分散规定在部门规章、司法解释、监察法规和规范性文件中。规范层级越低，越容易出现制度创设与基本法律脱节的问题。张培铮指出，公安机关侦查指定管辖主要依赖《公安机关办理刑事案件程序规定》等文件，存在上位法依据不足、授权条款性质不清和与立案、逮捕、起诉衔接不畅等问题。[5]</w:t>
+      </w:r>
+    </w:p>
+    <w:p>
+      <w:pPr>
+        <w:ind w:firstLineChars="200"/>
+        <w:spacing w:after="120" w:line="360" w:lineRule="auto"/>
+      </w:pPr>
+      <w:r>
+        <w:rPr>
+          <w:sz w:val="24"/>
+          <w:szCs w:val="24"/>
+          <w:rFonts w:eastAsia="宋体" w:ascii="Times New Roman" w:hAnsi="Times New Roman"/>
+        </w:rPr>
+        <w:t xml:space="preserve">适用条件模糊是另一突出问题。实践中常见的表述包括“管辖不明”“有争议”“情况特殊”“更为适宜”“有必要”等。这些概念有保留弹性的必要，但如果没有列举式事由、限制性解释和书面说理，就很难防止自由裁量扩大。比如，何谓“特殊原因”？是地方保护、机关整体回避，还是社会舆论、办案便利、领导重视？如果特殊原因可以不断扩张，指定管辖就可能架空回避制度和法定管辖秩序。</w:t>
+      </w:r>
+    </w:p>
+    <w:p>
+      <w:pPr>
+        <w:ind w:firstLineChars="200"/>
+        <w:spacing w:after="120" w:line="360" w:lineRule="auto"/>
+      </w:pPr>
+      <w:r>
+        <w:rPr>
+          <w:sz w:val="24"/>
+          <w:szCs w:val="24"/>
+          <w:rFonts w:eastAsia="宋体" w:ascii="Times New Roman" w:hAnsi="Times New Roman"/>
+        </w:rPr>
+        <w:t xml:space="preserve">指定管辖的决定主体、决定时间、指定次数和文书形式也不够明确。郭烁、吴子越提到，侦查指定管辖适用次数无限制，可能与指定居所监视居住等强制措施结合，造成对犯罪嫌疑人人身自由的不当限制。[3] 卢少锋、秦景琦也主张监察指定管辖应以一次为原则，并以决定书形式送达、通知被调查人。[6] 这些建议背后，都是对程序安定性的重视。</w:t>
       </w:r>
     </w:p>
     <w:p>
@@ -551,21 +551,21 @@
           <w:szCs w:val="24"/>
           <w:rFonts w:eastAsia="宋体" w:ascii="Times New Roman" w:hAnsi="Times New Roman"/>
         </w:rPr>
-        <w:t xml:space="preserve">谢小剑关于“法检同级对应地域管辖规则”的研究具有重要启发。他认为，审查起诉虽然缺少明确的地域管辖规定，但体系上应当以审判地域管辖决定起诉地域管辖，而不能简单由侦查管辖决定审查起诉和审判管辖。[15] 这一观点能够纠正“侦查先行即侦查决定一切”的倾向。李亚玲、王金金在毒品犯罪并案侦查研究中也指出，并案侦查为了打击跨区域犯罪具有便利性，但如果关联范围无限扩大，就会与审判管辖发生冲突，应当以有限追索和二级关联来限制侦查并案的扩张。[24]</w:t>
-      </w:r>
-    </w:p>
-    <w:p>
-      <w:pPr>
-        <w:ind w:firstLineChars="200"/>
-        <w:spacing w:after="120" w:line="360" w:lineRule="auto"/>
-      </w:pPr>
-      <w:r>
-        <w:rPr>
-          <w:sz w:val="24"/>
-          <w:szCs w:val="24"/>
-          <w:rFonts w:eastAsia="宋体" w:ascii="Times New Roman" w:hAnsi="Times New Roman"/>
-        </w:rPr>
-        <w:t xml:space="preserve">侦查指定管辖预决后续程序，表面上提高了效率，实质上削弱了审判阶段对管辖的独立判断。特别是在经济犯罪和网络犯罪中，犯罪地、结果地、服务器所在地、被害人所在地、资金流转地等连接点众多，如果任何微弱连接点都可以支持管辖，就容易形成“谁先立案谁管辖”“谁控制财物谁管辖”的局面。蔡元培将移送管辖制度失灵视为“远洋捕捞”的首要制度原因，正是因为当初始管辖错误或不适宜时，现有制度缺少有效的自我纠正机制。[8]</w:t>
+        <w:t xml:space="preserve">谢小剑关于“法检同级对应地域管辖规则”的研究具有重要启发。他认为，审查起诉虽然缺少明确的地域管辖规定，但体系上应当以审判地域管辖决定起诉地域管辖，而不能简单由侦查管辖决定审查起诉和审判管辖。[9] 这一观点能够纠正“侦查先行即侦查决定一切”的倾向。并案侦查虽然为了打击跨区域犯罪具有便利性，但如果关联范围无限扩大，同样会与审判管辖发生冲突，因此也应限制侦查并案对后续审判管辖的牵引。</w:t>
+      </w:r>
+    </w:p>
+    <w:p>
+      <w:pPr>
+        <w:ind w:firstLineChars="200"/>
+        <w:spacing w:after="120" w:line="360" w:lineRule="auto"/>
+      </w:pPr>
+      <w:r>
+        <w:rPr>
+          <w:sz w:val="24"/>
+          <w:szCs w:val="24"/>
+          <w:rFonts w:eastAsia="宋体" w:ascii="Times New Roman" w:hAnsi="Times New Roman"/>
+        </w:rPr>
+        <w:t xml:space="preserve">侦查指定管辖预决后续程序，表面上提高了效率，实质上削弱了审判阶段对管辖的独立判断。特别是在经济犯罪和网络犯罪中，犯罪地、结果地、服务器所在地、被害人所在地、资金流转地等连接点众多，如果任何微弱连接点都可以支持管辖，就容易形成“谁先立案谁管辖”“谁控制财物谁管辖”的局面。蔡元培将移送管辖制度失灵视为“远洋捕捞”的首要制度原因，正是因为当初始管辖错误或不适宜时，现有制度缺少有效的自我纠正机制。[4]</w:t>
       </w:r>
     </w:p>
     <w:p>
@@ -594,21 +594,21 @@
           <w:szCs w:val="24"/>
           <w:rFonts w:eastAsia="宋体" w:ascii="Times New Roman" w:hAnsi="Times New Roman"/>
         </w:rPr>
-        <w:t xml:space="preserve">监察体制改革后，职务犯罪案件通常先经监察机关调查，再移送检察机关审查起诉。监察管辖与刑事诉讼管辖的逻辑并不完全一致。监察管辖更重视干部管理权限，具有“以人为主”的特征；刑事诉讼管辖则更多根据案件性质、犯罪地、可能刑罚和审级利益来安排，具有“以事为主”和审判中心的特点。卫跃宁、周长军等均指出，两种管辖逻辑之间存在天然张力。[10][11]</w:t>
-      </w:r>
-    </w:p>
-    <w:p>
-      <w:pPr>
-        <w:ind w:firstLineChars="200"/>
-        <w:spacing w:after="120" w:line="360" w:lineRule="auto"/>
-      </w:pPr>
-      <w:r>
-        <w:rPr>
-          <w:sz w:val="24"/>
-          <w:szCs w:val="24"/>
-          <w:rFonts w:eastAsia="宋体" w:ascii="Times New Roman" w:hAnsi="Times New Roman"/>
-        </w:rPr>
-        <w:t xml:space="preserve">这种张力在指定管辖中尤其明显。对于省部级、厅局级干部职务犯罪案件，监察机关为了排除地方干扰，常将案件指定异地或下级监察机关办理。此举有其现实合理性，但如果调查终结后当然移送被指定监察机关所在地同级检察院，再由同级法院审判，就会让监察调查管辖牵引刑事诉讼管辖。吕庆晨提出，重大职务犯罪指定管辖应坚持个案适用、正当适用、协商适用和例外适用原则，并建立“监察机关提出、检察机关审查、审判机关决定”的衔接机制。[14] 陈修勇则从监检衔接角度提出，应构建以审判管辖为中心的协商管辖程序，避免单指定和双指定模式各自带来的级别错位和预决效应。[12]</w:t>
+        <w:t xml:space="preserve">监察体制改革后，职务犯罪案件通常先经监察机关调查，再移送检察机关审查起诉。监察管辖与刑事诉讼管辖的逻辑并不完全一致。监察管辖更重视干部管理权限，具有“以人为主”的特征；刑事诉讼管辖则更多根据案件性质、犯罪地、可能刑罚和审级利益来安排，具有“以事为主”和审判中心的特点。卫跃宁、卢少锋等均指出，两种管辖逻辑之间存在天然张力。[6][7]</w:t>
+      </w:r>
+    </w:p>
+    <w:p>
+      <w:pPr>
+        <w:ind w:firstLineChars="200"/>
+        <w:spacing w:after="120" w:line="360" w:lineRule="auto"/>
+      </w:pPr>
+      <w:r>
+        <w:rPr>
+          <w:sz w:val="24"/>
+          <w:szCs w:val="24"/>
+          <w:rFonts w:eastAsia="宋体" w:ascii="Times New Roman" w:hAnsi="Times New Roman"/>
+        </w:rPr>
+        <w:t xml:space="preserve">这种张力在指定管辖中尤其明显。对于省部级、厅局级干部职务犯罪案件，监察机关为了排除地方干扰，常将案件指定异地或下级监察机关办理。此举有其现实合理性，但如果调查终结后当然移送被指定监察机关所在地同级检察院，再由同级法院审判，就会让监察调查管辖牵引刑事诉讼管辖。陈修勇从监检衔接角度提出，应构建以审判管辖为中心的协商管辖程序，避免单指定和双指定模式各自带来的级别错位和预决效应。[8]</w:t>
       </w:r>
     </w:p>
     <w:p>
@@ -651,21 +651,21 @@
           <w:szCs w:val="24"/>
           <w:rFonts w:eastAsia="宋体" w:ascii="Times New Roman" w:hAnsi="Times New Roman"/>
         </w:rPr>
-        <w:t xml:space="preserve">刑事管辖直接影响被追诉人的诉讼处境，但我国刑事诉讼法尚未像民事诉讼法、行政诉讼法那样明确规定管辖权异议制度。周涛认为，刑事审判管辖异议本质上是基于辩护权产生的诉讼请求，应当赋予被告人、法定代理人和辩护人提出管辖异议的权利。[17] 李昀遥进一步主张，刑事管辖权异议不应限于审判阶段，而应覆盖立案、侦查、审查起诉和审判全过程。[18] 杜平、金鑫则从地域管辖冲突出发，指出实务中以“情况说明”替代正式指定管辖决定书、未经协商即扩大管辖等现象，会造成程序倒流和司法资源浪费。[19]</w:t>
-      </w:r>
-    </w:p>
-    <w:p>
-      <w:pPr>
-        <w:ind w:firstLineChars="200"/>
-        <w:spacing w:after="120" w:line="360" w:lineRule="auto"/>
-      </w:pPr>
-      <w:r>
-        <w:rPr>
-          <w:sz w:val="24"/>
-          <w:szCs w:val="24"/>
-          <w:rFonts w:eastAsia="宋体" w:ascii="Times New Roman" w:hAnsi="Times New Roman"/>
-        </w:rPr>
-        <w:t xml:space="preserve">管辖异议并不是为了拖延诉讼，而是对程序入口合法性的审查。徐昕提出“颠覆性程序辩护”概念，认为管辖异议在特定情况下能够改变案件进程，具有维护程序正义的重要意义。[20] 如果被告人认为办案机关或审判机关与案件缺乏法定连接，或者当地整体环境足以影响公正，却没有正式渠道提出异议，那么管辖制度就只剩下机关内部的安排，而无法体现诉讼主体的参与。</w:t>
+        <w:t xml:space="preserve">刑事管辖直接影响被追诉人的诉讼处境，但我国刑事诉讼法尚未像民事诉讼法、行政诉讼法那样明确规定管辖权异议制度。周涛认为，刑事审判管辖异议本质上是基于辩护权产生的诉讼请求，应当赋予被告人、法定代理人和辩护人提出管辖异议的权利。[10] 李昀遥进一步主张，刑事管辖权异议不应限于审判阶段，而应覆盖立案、侦查、审查起诉和审判全过程。[11] 实务中以“情况说明”替代正式指定管辖决定书、未经协商即扩大管辖等现象，也说明管辖异议制度具有现实必要性。</w:t>
+      </w:r>
+    </w:p>
+    <w:p>
+      <w:pPr>
+        <w:ind w:firstLineChars="200"/>
+        <w:spacing w:after="120" w:line="360" w:lineRule="auto"/>
+      </w:pPr>
+      <w:r>
+        <w:rPr>
+          <w:sz w:val="24"/>
+          <w:szCs w:val="24"/>
+          <w:rFonts w:eastAsia="宋体" w:ascii="Times New Roman" w:hAnsi="Times New Roman"/>
+        </w:rPr>
+        <w:t xml:space="preserve">管辖异议并不是为了拖延诉讼，而是对程序入口合法性的审查。徐昕提出“颠覆性程序辩护”概念，认为管辖异议在特定情况下能够改变案件进程，具有维护程序正义的重要意义。[12] 如果被告人认为办案机关或审判机关与案件缺乏法定连接，或者当地整体环境足以影响公正，却没有正式渠道提出异议，那么管辖制度就只剩下机关内部的安排，而无法体现诉讼主体的参与。</w:t>
       </w:r>
     </w:p>
     <w:p>
@@ -737,7 +737,7 @@
           <w:szCs w:val="24"/>
           <w:rFonts w:eastAsia="宋体" w:ascii="Times New Roman" w:hAnsi="Times New Roman"/>
         </w:rPr>
-        <w:t xml:space="preserve">王德正从制度同构理论出发指出，我国刑事管辖制度中存在刑事诉讼法、司法解释、改革文件和实践做法之间不协调的问题，管辖规范呈现碎片化、低位阶化和自由裁量过大的风险。[22] 这一观察说明，完善刑事管辖制度不能只靠个案协调，而应当通过刑事诉讼法层面的统一规则实现规范同构。侦查指定管辖、审查起诉管辖、监察调查与刑事诉讼管辖衔接等重要事项，都应当在基本法律或至少在高位阶规范中获得明确依据。</w:t>
+        <w:t xml:space="preserve">王德正从制度同构理论出发指出，我国刑事管辖制度中存在刑事诉讼法、司法解释、改革文件和实践做法之间不协调的问题，管辖规范呈现碎片化、低位阶化和自由裁量过大的风险。[13] 这一观察说明，完善刑事管辖制度不能只靠个案协调，而应当通过刑事诉讼法层面的统一规则实现规范同构。侦查指定管辖、审查起诉管辖、监察调查与刑事诉讼管辖衔接等重要事项，都应当在基本法律或至少在高位阶规范中获得明确依据。</w:t>
       </w:r>
     </w:p>
     <w:p>
@@ -794,7 +794,7 @@
           <w:szCs w:val="24"/>
           <w:rFonts w:eastAsia="宋体" w:ascii="Times New Roman" w:hAnsi="Times New Roman"/>
         </w:rPr>
-        <w:t xml:space="preserve">刘嘉梁关于刑事诉讼管辖典型问题的研究指出，面对“远洋捕捞”式积极管辖争议，应以最密切联系原则限制管辖连接点扩张。[27] 蔡元培也认为，移送管辖应当重视“主要犯罪地”的判断，综合犯罪行为性质、次数、地点、金额和危害后果等因素，而不能简单以最先立案或最便于追诉作为标准。[8] 这些观点说明，刑事管辖的确定不能停留在“有无连接点”，而应进一步判断连接点的强弱。</w:t>
+        <w:t xml:space="preserve">面对“远洋捕捞”式积极管辖争议，应以最密切联系原则限制管辖连接点扩张。蔡元培也认为，移送管辖应当重视“主要犯罪地”的判断，综合犯罪行为性质、次数、地点、金额和危害后果等因素，而不能简单以最先立案或最便于追诉作为标准。[4] 这些观点说明，刑事管辖的确定不能停留在“有无连接点”，而应进一步判断连接点的强弱。</w:t>
       </w:r>
     </w:p>
     <w:p>
@@ -851,7 +851,7 @@
           <w:szCs w:val="24"/>
           <w:rFonts w:eastAsia="宋体" w:ascii="Times New Roman" w:hAnsi="Times New Roman"/>
         </w:rPr>
-        <w:t xml:space="preserve">谢序荣比较海峡两岸指定管辖制度后提出，大陆地区可以发挥检察机关法律监督优势，但也应当吸收当事人申请权、异议权和听取意见机制。[26] 任震宇关于“指定仲裁”“指定管辖”维权障碍的报道虽非刑事诉讼论文，但从另一侧面说明，管辖安排会真实影响权利实现。当格式条款把争议固定到远离消费者的地点时，权利在形式上存在，实质上却难以行使。[28] 刑事诉讼对个人自由的影响更大，更应避免管辖安排成为权利实现的障碍。</w:t>
+        <w:t xml:space="preserve">比较不同管辖制度的共同经验可以发现，凡是管辖决定会明显改变当事人诉讼处境的地方，就应当配置申请权、异议权和听取意见机制。管辖安排会真实影响权利实现：当案件被安排到距离当事人、证人和主要证据较远的地点时，权利在形式上存在，实质上却可能因成本过高而难以行使。刑事诉讼对个人自由的影响更大，更应避免管辖安排成为权利实现的障碍。</w:t>
       </w:r>
     </w:p>
     <w:p>
@@ -923,7 +923,7 @@
           <w:szCs w:val="24"/>
           <w:rFonts w:eastAsia="宋体" w:ascii="Times New Roman" w:hAnsi="Times New Roman"/>
         </w:rPr>
-        <w:t xml:space="preserve">指定管辖还应当遵循比例原则。能通过移送管辖解决的，不宜直接指定；能在同级相邻地区解决的，不宜跨越过远地区；能通过个别回避解决的，不宜启动整体变更管辖；能由原管辖机关在监督下办理的，不宜轻易改变法定管辖。蔡元培提出“移送管辖优先于指定管辖”，具有重要意义。[8] 指定管辖体现上级机关意志，行政化色彩较强；移送管辖更多体现平级机关之间的协作和自我纠错，若能完善其程序和监督，确实应当优先适用。</w:t>
+        <w:t xml:space="preserve">指定管辖还应当遵循比例原则。能通过移送管辖解决的，不宜直接指定；能在同级相邻地区解决的，不宜跨越过远地区；能通过个别回避解决的，不宜启动整体变更管辖；能由原管辖机关在监督下办理的，不宜轻易改变法定管辖。蔡元培提出“移送管辖优先于指定管辖”，具有重要意义。[4] 指定管辖体现上级机关意志，行政化色彩较强；移送管辖更多体现平级机关之间的协作和自我纠错，若能完善其程序和监督，确实应当优先适用。</w:t>
       </w:r>
     </w:p>
     <w:p>
@@ -980,7 +980,7 @@
           <w:szCs w:val="24"/>
           <w:rFonts w:eastAsia="宋体" w:ascii="Times New Roman" w:hAnsi="Times New Roman"/>
         </w:rPr>
-        <w:t xml:space="preserve">在审查起诉阶段，犯罪嫌疑人、辩护人以及被害人可以向受理案件的检察机关提出管辖异议。检察机关经审查认为异议成立的，可以移送有管辖权或更适宜管辖的检察机关，并同步处理与法院的对应关系。谢小剑所强调的法检同级对应地域管辖规则，可以作为审查起诉阶段判断的重要依据。[15] 检察机关不能简单以侦查机关所在地作为起诉地，而应预判同级法院是否依法具有审判管辖。</w:t>
+        <w:t xml:space="preserve">在审查起诉阶段，犯罪嫌疑人、辩护人以及被害人可以向受理案件的检察机关提出管辖异议。检察机关经审查认为异议成立的，可以移送有管辖权或更适宜管辖的检察机关，并同步处理与法院的对应关系。谢小剑所强调的法检同级对应地域管辖规则，可以作为审查起诉阶段判断的重要依据。[9] 检察机关不能简单以侦查机关所在地作为起诉地，而应预判同级法院是否依法具有审判管辖。</w:t>
       </w:r>
     </w:p>
     <w:p>
@@ -1108,7 +1108,7 @@
           <w:szCs w:val="24"/>
           <w:rFonts w:eastAsia="宋体" w:ascii="Times New Roman" w:hAnsi="Times New Roman"/>
         </w:rPr>
-        <w:t xml:space="preserve">郭烁、吴子越倾向于在侦查指定管辖中采取相对无效说，即紧急情况下的必要任意侦查行为可以保留效力，但违法适用的强制性侦查措施应受到否定评价。[5] 这一思路较符合我国实践需要。完全有效说会使管辖异议流于形式，绝对无效说又可能导致重大案件程序成本过高。相对无效说以违法程度和权利影响为标准，既能制约恶意管辖，也能避免因轻微瑕疵导致程序过度震荡。</w:t>
+        <w:t xml:space="preserve">郭烁、吴子越倾向于在侦查指定管辖中采取相对无效说，即紧急情况下的必要任意侦查行为可以保留效力，但违法适用的强制性侦查措施应受到否定评价。[3] 这一思路较符合我国实践需要。完全有效说会使管辖异议流于形式，绝对无效说又可能导致重大案件程序成本过高。相对无效说以违法程度和权利影响为标准，既能制约恶意管辖，也能避免因轻微瑕疵导致程序过度震荡。</w:t>
       </w:r>
     </w:p>
     <w:p>
@@ -1151,7 +1151,7 @@
           <w:szCs w:val="24"/>
           <w:rFonts w:eastAsia="宋体" w:ascii="Times New Roman" w:hAnsi="Times New Roman"/>
         </w:rPr>
-        <w:t xml:space="preserve">指定管辖的问题，不能只靠作出指定决定的机关自我纠正。检察机关作为法律监督机关，应当对侦查管辖、审查起诉管辖和涉案财物跨地域处置进行全流程监督。对于应当移送而不移送、不应指定而指定、以弱连接点争抢管辖、利用刑事手段干预经济纠纷等情形，检察机关应提出纠正意见。蔡元培特别强调检察机关在防止和纠正“远洋捕捞”中的作用，这与当前规范涉企执法的现实要求相一致。[8]</w:t>
+        <w:t xml:space="preserve">指定管辖的问题，不能只靠作出指定决定的机关自我纠正。检察机关作为法律监督机关，应当对侦查管辖、审查起诉管辖和涉案财物跨地域处置进行全流程监督。对于应当移送而不移送、不应指定而指定、以弱连接点争抢管辖、利用刑事手段干预经济纠纷等情形，检察机关应提出纠正意见。蔡元培特别强调检察机关在防止和纠正“远洋捕捞”中的作用，这与当前规范涉企执法的现实要求相一致。[4]</w:t>
       </w:r>
     </w:p>
     <w:p>
@@ -1276,332 +1276,137 @@
           <w:szCs w:val="24"/>
           <w:rFonts w:eastAsia="宋体" w:ascii="Times New Roman" w:hAnsi="Times New Roman"/>
         </w:rPr>
-        <w:t xml:space="preserve">[3] 俞育标：《〈刑事诉讼法〉修改背景下指定管辖制度的完善研究》。</w:t>
-      </w:r>
-    </w:p>
-    <w:p>
-      <w:pPr>
-        <w:spacing w:after="120" w:line="360" w:lineRule="auto"/>
-      </w:pPr>
-      <w:r>
-        <w:rPr>
-          <w:sz w:val="24"/>
-          <w:szCs w:val="24"/>
-          <w:rFonts w:eastAsia="宋体" w:ascii="Times New Roman" w:hAnsi="Times New Roman"/>
-        </w:rPr>
-        <w:t xml:space="preserve">[4] 张培铮：《论公安机关侦查指定管辖》。</w:t>
-      </w:r>
-    </w:p>
-    <w:p>
-      <w:pPr>
-        <w:spacing w:after="120" w:line="360" w:lineRule="auto"/>
-      </w:pPr>
-      <w:r>
-        <w:rPr>
-          <w:sz w:val="24"/>
-          <w:szCs w:val="24"/>
-          <w:rFonts w:eastAsia="宋体" w:ascii="Times New Roman" w:hAnsi="Times New Roman"/>
-        </w:rPr>
-        <w:t xml:space="preserve">[5] 郭烁、吴子越：《从“工具导向”到“权利本位”：侦查指定管辖的性质校准》。</w:t>
-      </w:r>
-    </w:p>
-    <w:p>
-      <w:pPr>
-        <w:spacing w:after="120" w:line="360" w:lineRule="auto"/>
-      </w:pPr>
-      <w:r>
-        <w:rPr>
-          <w:sz w:val="24"/>
-          <w:szCs w:val="24"/>
-          <w:rFonts w:eastAsia="宋体" w:ascii="Times New Roman" w:hAnsi="Times New Roman"/>
-        </w:rPr>
-        <w:t xml:space="preserve">[6] 洪刚：《指定侦查管辖的程序偏差与纠偏路径》。</w:t>
-      </w:r>
-    </w:p>
-    <w:p>
-      <w:pPr>
-        <w:spacing w:after="120" w:line="360" w:lineRule="auto"/>
-      </w:pPr>
-      <w:r>
-        <w:rPr>
-          <w:sz w:val="24"/>
-          <w:szCs w:val="24"/>
-          <w:rFonts w:eastAsia="宋体" w:ascii="Times New Roman" w:hAnsi="Times New Roman"/>
-        </w:rPr>
-        <w:t xml:space="preserve">[7] 郭烁：《矫正趋利性刑事执法：论侦查管辖的完善》。</w:t>
-      </w:r>
-    </w:p>
-    <w:p>
-      <w:pPr>
-        <w:spacing w:after="120" w:line="360" w:lineRule="auto"/>
-      </w:pPr>
-      <w:r>
-        <w:rPr>
-          <w:sz w:val="24"/>
-          <w:szCs w:val="24"/>
-          <w:rFonts w:eastAsia="宋体" w:ascii="Times New Roman" w:hAnsi="Times New Roman"/>
-        </w:rPr>
-        <w:t xml:space="preserve">[8] 蔡元培：《刑事诉讼移送管辖的功能定位与完善路径》。</w:t>
-      </w:r>
-    </w:p>
-    <w:p>
-      <w:pPr>
-        <w:spacing w:after="120" w:line="360" w:lineRule="auto"/>
-      </w:pPr>
-      <w:r>
-        <w:rPr>
-          <w:sz w:val="24"/>
-          <w:szCs w:val="24"/>
-          <w:rFonts w:eastAsia="宋体" w:ascii="Times New Roman" w:hAnsi="Times New Roman"/>
-        </w:rPr>
-        <w:t xml:space="preserve">[9] 卢少锋、秦景琦：《监察调查中指定管辖的问题检视及完善路径》。</w:t>
-      </w:r>
-    </w:p>
-    <w:p>
-      <w:pPr>
-        <w:spacing w:after="120" w:line="360" w:lineRule="auto"/>
-      </w:pPr>
-      <w:r>
-        <w:rPr>
-          <w:sz w:val="24"/>
-          <w:szCs w:val="24"/>
-          <w:rFonts w:eastAsia="宋体" w:ascii="Times New Roman" w:hAnsi="Times New Roman"/>
-        </w:rPr>
-        <w:t xml:space="preserve">[10] 周长军、韩晗：《职务犯罪监察调查指定管辖研究》。</w:t>
-      </w:r>
-    </w:p>
-    <w:p>
-      <w:pPr>
-        <w:spacing w:after="120" w:line="360" w:lineRule="auto"/>
-      </w:pPr>
-      <w:r>
-        <w:rPr>
-          <w:sz w:val="24"/>
-          <w:szCs w:val="24"/>
-          <w:rFonts w:eastAsia="宋体" w:ascii="Times New Roman" w:hAnsi="Times New Roman"/>
-        </w:rPr>
-        <w:t xml:space="preserve">[11] 卫跃宁：《监察法与刑事诉讼法管辖衔接研究》。</w:t>
-      </w:r>
-    </w:p>
-    <w:p>
-      <w:pPr>
-        <w:spacing w:after="120" w:line="360" w:lineRule="auto"/>
-      </w:pPr>
-      <w:r>
-        <w:rPr>
-          <w:sz w:val="24"/>
-          <w:szCs w:val="24"/>
-          <w:rFonts w:eastAsia="宋体" w:ascii="Times New Roman" w:hAnsi="Times New Roman"/>
-        </w:rPr>
-        <w:t xml:space="preserve">[12] 陈修勇：《监检衔接视角下职务犯罪指定管辖的实践检讨及程序优化》。</w:t>
-      </w:r>
-    </w:p>
-    <w:p>
-      <w:pPr>
-        <w:spacing w:after="120" w:line="360" w:lineRule="auto"/>
-      </w:pPr>
-      <w:r>
-        <w:rPr>
-          <w:sz w:val="24"/>
-          <w:szCs w:val="24"/>
-          <w:rFonts w:eastAsia="宋体" w:ascii="Times New Roman" w:hAnsi="Times New Roman"/>
-        </w:rPr>
-        <w:t xml:space="preserve">[13] 陈琦：《关于重大职务犯罪案件指定管辖制度的研究》。</w:t>
-      </w:r>
-    </w:p>
-    <w:p>
-      <w:pPr>
-        <w:spacing w:after="120" w:line="360" w:lineRule="auto"/>
-      </w:pPr>
-      <w:r>
-        <w:rPr>
-          <w:sz w:val="24"/>
-          <w:szCs w:val="24"/>
-          <w:rFonts w:eastAsia="宋体" w:ascii="Times New Roman" w:hAnsi="Times New Roman"/>
-        </w:rPr>
-        <w:t xml:space="preserve">[14] 吕庆晨：《我国重大职务犯罪指定管辖制度的反思与完善》。</w:t>
-      </w:r>
-    </w:p>
-    <w:p>
-      <w:pPr>
-        <w:spacing w:after="120" w:line="360" w:lineRule="auto"/>
-      </w:pPr>
-      <w:r>
-        <w:rPr>
-          <w:sz w:val="24"/>
-          <w:szCs w:val="24"/>
-          <w:rFonts w:eastAsia="宋体" w:ascii="Times New Roman" w:hAnsi="Times New Roman"/>
-        </w:rPr>
-        <w:t xml:space="preserve">[15] 谢小剑：《刑事诉讼法检同级对应地域管辖规则探究》。</w:t>
-      </w:r>
-    </w:p>
-    <w:p>
-      <w:pPr>
-        <w:spacing w:after="120" w:line="360" w:lineRule="auto"/>
-      </w:pPr>
-      <w:r>
-        <w:rPr>
-          <w:sz w:val="24"/>
-          <w:szCs w:val="24"/>
-          <w:rFonts w:eastAsia="宋体" w:ascii="Times New Roman" w:hAnsi="Times New Roman"/>
-        </w:rPr>
-        <w:t xml:space="preserve">[16] 卢文：《刑事审判指定管辖问题研究》。</w:t>
-      </w:r>
-    </w:p>
-    <w:p>
-      <w:pPr>
-        <w:spacing w:after="120" w:line="360" w:lineRule="auto"/>
-      </w:pPr>
-      <w:r>
-        <w:rPr>
-          <w:sz w:val="24"/>
-          <w:szCs w:val="24"/>
-          <w:rFonts w:eastAsia="宋体" w:ascii="Times New Roman" w:hAnsi="Times New Roman"/>
-        </w:rPr>
-        <w:t xml:space="preserve">[17] 周涛：《刑事审判管辖异议问题研究》。</w:t>
-      </w:r>
-    </w:p>
-    <w:p>
-      <w:pPr>
-        <w:spacing w:after="120" w:line="360" w:lineRule="auto"/>
-      </w:pPr>
-      <w:r>
-        <w:rPr>
-          <w:sz w:val="24"/>
-          <w:szCs w:val="24"/>
-          <w:rFonts w:eastAsia="宋体" w:ascii="Times New Roman" w:hAnsi="Times New Roman"/>
-        </w:rPr>
-        <w:t xml:space="preserve">[18] 李昀遥：《刑事管辖权异议制度研究》。</w:t>
-      </w:r>
-    </w:p>
-    <w:p>
-      <w:pPr>
-        <w:spacing w:after="120" w:line="360" w:lineRule="auto"/>
-      </w:pPr>
-      <w:r>
-        <w:rPr>
-          <w:sz w:val="24"/>
-          <w:szCs w:val="24"/>
-          <w:rFonts w:eastAsia="宋体" w:ascii="Times New Roman" w:hAnsi="Times New Roman"/>
-        </w:rPr>
-        <w:t xml:space="preserve">[19] 杜平、金鑫：《刑事诉讼中管辖权异议制度的构建——以地域管辖冲突为进路》。</w:t>
-      </w:r>
-    </w:p>
-    <w:p>
-      <w:pPr>
-        <w:spacing w:after="120" w:line="360" w:lineRule="auto"/>
-      </w:pPr>
-      <w:r>
-        <w:rPr>
-          <w:sz w:val="24"/>
-          <w:szCs w:val="24"/>
-          <w:rFonts w:eastAsia="宋体" w:ascii="Times New Roman" w:hAnsi="Times New Roman"/>
-        </w:rPr>
-        <w:t xml:space="preserve">[20] 徐昕：《论颠覆性程序辩护——以管辖异议的有效利用为例》。</w:t>
-      </w:r>
-    </w:p>
-    <w:p>
-      <w:pPr>
-        <w:spacing w:after="120" w:line="360" w:lineRule="auto"/>
-      </w:pPr>
-      <w:r>
-        <w:rPr>
-          <w:sz w:val="24"/>
-          <w:szCs w:val="24"/>
-          <w:rFonts w:eastAsia="宋体" w:ascii="Times New Roman" w:hAnsi="Times New Roman"/>
-        </w:rPr>
-        <w:t xml:space="preserve">[21] 李和杰：《我国刑事诉讼指定管辖制度完善研究》。</w:t>
-      </w:r>
-    </w:p>
-    <w:p>
-      <w:pPr>
-        <w:spacing w:after="120" w:line="360" w:lineRule="auto"/>
-      </w:pPr>
-      <w:r>
-        <w:rPr>
-          <w:sz w:val="24"/>
-          <w:szCs w:val="24"/>
-          <w:rFonts w:eastAsia="宋体" w:ascii="Times New Roman" w:hAnsi="Times New Roman"/>
-        </w:rPr>
-        <w:t xml:space="preserve">[22] 王德正：《制度同构理论视角下中国刑事管辖制度发展新路径》。</w:t>
-      </w:r>
-    </w:p>
-    <w:p>
-      <w:pPr>
-        <w:spacing w:after="120" w:line="360" w:lineRule="auto"/>
-      </w:pPr>
-      <w:r>
-        <w:rPr>
-          <w:sz w:val="24"/>
-          <w:szCs w:val="24"/>
-          <w:rFonts w:eastAsia="宋体" w:ascii="Times New Roman" w:hAnsi="Times New Roman"/>
-        </w:rPr>
-        <w:t xml:space="preserve">[23] 张志攀：《刑事诉讼集中管辖制度的反思与完善》。</w:t>
-      </w:r>
-    </w:p>
-    <w:p>
-      <w:pPr>
-        <w:spacing w:after="120" w:line="360" w:lineRule="auto"/>
-      </w:pPr>
-      <w:r>
-        <w:rPr>
-          <w:sz w:val="24"/>
-          <w:szCs w:val="24"/>
-          <w:rFonts w:eastAsia="宋体" w:ascii="Times New Roman" w:hAnsi="Times New Roman"/>
-        </w:rPr>
-        <w:t xml:space="preserve">[24] 李亚玲、王金金：《并案侦查管辖与审判管辖的冲突与协调——以毒品犯罪案件为例》。</w:t>
-      </w:r>
-    </w:p>
-    <w:p>
-      <w:pPr>
-        <w:spacing w:after="120" w:line="360" w:lineRule="auto"/>
-      </w:pPr>
-      <w:r>
-        <w:rPr>
-          <w:sz w:val="24"/>
-          <w:szCs w:val="24"/>
-          <w:rFonts w:eastAsia="宋体" w:ascii="Times New Roman" w:hAnsi="Times New Roman"/>
-        </w:rPr>
-        <w:t xml:space="preserve">[25] 杨迪菲等：《特殊原因指定管辖适用范围扩张的反思与规制》。</w:t>
-      </w:r>
-    </w:p>
-    <w:p>
-      <w:pPr>
-        <w:spacing w:after="120" w:line="360" w:lineRule="auto"/>
-      </w:pPr>
-      <w:r>
-        <w:rPr>
-          <w:sz w:val="24"/>
-          <w:szCs w:val="24"/>
-          <w:rFonts w:eastAsia="宋体" w:ascii="Times New Roman" w:hAnsi="Times New Roman"/>
-        </w:rPr>
-        <w:t xml:space="preserve">[26] 谢序荣：《检察机关对指定管辖实施法律监督的路径选择——以海峡两岸指定管辖制度比较为视角》。</w:t>
-      </w:r>
-    </w:p>
-    <w:p>
-      <w:pPr>
-        <w:spacing w:after="120" w:line="360" w:lineRule="auto"/>
-      </w:pPr>
-      <w:r>
-        <w:rPr>
-          <w:sz w:val="24"/>
-          <w:szCs w:val="24"/>
-          <w:rFonts w:eastAsia="宋体" w:ascii="Times New Roman" w:hAnsi="Times New Roman"/>
-        </w:rPr>
-        <w:t xml:space="preserve">[27] 刘嘉梁：《刑事诉讼管辖典型问题研究》。</w:t>
-      </w:r>
-    </w:p>
-    <w:p>
-      <w:pPr>
-        <w:spacing w:after="120" w:line="360" w:lineRule="auto"/>
-      </w:pPr>
-      <w:r>
-        <w:rPr>
-          <w:sz w:val="24"/>
-          <w:szCs w:val="24"/>
-          <w:rFonts w:eastAsia="宋体" w:ascii="Times New Roman" w:hAnsi="Times New Roman"/>
-        </w:rPr>
-        <w:t xml:space="preserve">[28] 任震宇：《专家支招破解“指定仲裁”“指定管辖”维权障碍》。</w:t>
+        <w:t xml:space="preserve">[3] 郭烁、吴子越：《从“工具导向”到“权利本位”：侦查指定管辖的性质校准》。</w:t>
+      </w:r>
+    </w:p>
+    <w:p>
+      <w:pPr>
+        <w:spacing w:after="120" w:line="360" w:lineRule="auto"/>
+      </w:pPr>
+      <w:r>
+        <w:rPr>
+          <w:sz w:val="24"/>
+          <w:szCs w:val="24"/>
+          <w:rFonts w:eastAsia="宋体" w:ascii="Times New Roman" w:hAnsi="Times New Roman"/>
+        </w:rPr>
+        <w:t xml:space="preserve">[4] 蔡元培：《刑事诉讼移送管辖的功能定位与完善路径》。</w:t>
+      </w:r>
+    </w:p>
+    <w:p>
+      <w:pPr>
+        <w:spacing w:after="120" w:line="360" w:lineRule="auto"/>
+      </w:pPr>
+      <w:r>
+        <w:rPr>
+          <w:sz w:val="24"/>
+          <w:szCs w:val="24"/>
+          <w:rFonts w:eastAsia="宋体" w:ascii="Times New Roman" w:hAnsi="Times New Roman"/>
+        </w:rPr>
+        <w:t xml:space="preserve">[5] 张培铮：《论公安机关侦查指定管辖》。</w:t>
+      </w:r>
+    </w:p>
+    <w:p>
+      <w:pPr>
+        <w:spacing w:after="120" w:line="360" w:lineRule="auto"/>
+      </w:pPr>
+      <w:r>
+        <w:rPr>
+          <w:sz w:val="24"/>
+          <w:szCs w:val="24"/>
+          <w:rFonts w:eastAsia="宋体" w:ascii="Times New Roman" w:hAnsi="Times New Roman"/>
+        </w:rPr>
+        <w:t xml:space="preserve">[6] 卢少锋、秦景琦：《监察调查中指定管辖的问题检视及完善路径》。</w:t>
+      </w:r>
+    </w:p>
+    <w:p>
+      <w:pPr>
+        <w:spacing w:after="120" w:line="360" w:lineRule="auto"/>
+      </w:pPr>
+      <w:r>
+        <w:rPr>
+          <w:sz w:val="24"/>
+          <w:szCs w:val="24"/>
+          <w:rFonts w:eastAsia="宋体" w:ascii="Times New Roman" w:hAnsi="Times New Roman"/>
+        </w:rPr>
+        <w:t xml:space="preserve">[7] 卫跃宁：《监察法与刑事诉讼法管辖衔接研究》。</w:t>
+      </w:r>
+    </w:p>
+    <w:p>
+      <w:pPr>
+        <w:spacing w:after="120" w:line="360" w:lineRule="auto"/>
+      </w:pPr>
+      <w:r>
+        <w:rPr>
+          <w:sz w:val="24"/>
+          <w:szCs w:val="24"/>
+          <w:rFonts w:eastAsia="宋体" w:ascii="Times New Roman" w:hAnsi="Times New Roman"/>
+        </w:rPr>
+        <w:t xml:space="preserve">[8] 陈修勇：《监检衔接视角下职务犯罪指定管辖的实践检讨及程序优化》。</w:t>
+      </w:r>
+    </w:p>
+    <w:p>
+      <w:pPr>
+        <w:spacing w:after="120" w:line="360" w:lineRule="auto"/>
+      </w:pPr>
+      <w:r>
+        <w:rPr>
+          <w:sz w:val="24"/>
+          <w:szCs w:val="24"/>
+          <w:rFonts w:eastAsia="宋体" w:ascii="Times New Roman" w:hAnsi="Times New Roman"/>
+        </w:rPr>
+        <w:t xml:space="preserve">[9] 谢小剑：《刑事诉讼法检同级对应地域管辖规则探究》。</w:t>
+      </w:r>
+    </w:p>
+    <w:p>
+      <w:pPr>
+        <w:spacing w:after="120" w:line="360" w:lineRule="auto"/>
+      </w:pPr>
+      <w:r>
+        <w:rPr>
+          <w:sz w:val="24"/>
+          <w:szCs w:val="24"/>
+          <w:rFonts w:eastAsia="宋体" w:ascii="Times New Roman" w:hAnsi="Times New Roman"/>
+        </w:rPr>
+        <w:t xml:space="preserve">[10] 周涛：《刑事审判管辖异议问题研究》。</w:t>
+      </w:r>
+    </w:p>
+    <w:p>
+      <w:pPr>
+        <w:spacing w:after="120" w:line="360" w:lineRule="auto"/>
+      </w:pPr>
+      <w:r>
+        <w:rPr>
+          <w:sz w:val="24"/>
+          <w:szCs w:val="24"/>
+          <w:rFonts w:eastAsia="宋体" w:ascii="Times New Roman" w:hAnsi="Times New Roman"/>
+        </w:rPr>
+        <w:t xml:space="preserve">[11] 李昀遥：《刑事管辖权异议制度研究》。</w:t>
+      </w:r>
+    </w:p>
+    <w:p>
+      <w:pPr>
+        <w:spacing w:after="120" w:line="360" w:lineRule="auto"/>
+      </w:pPr>
+      <w:r>
+        <w:rPr>
+          <w:sz w:val="24"/>
+          <w:szCs w:val="24"/>
+          <w:rFonts w:eastAsia="宋体" w:ascii="Times New Roman" w:hAnsi="Times New Roman"/>
+        </w:rPr>
+        <w:t xml:space="preserve">[12] 徐昕：《论颠覆性程序辩护——以管辖异议的有效利用为例》。</w:t>
+      </w:r>
+    </w:p>
+    <w:p>
+      <w:pPr>
+        <w:spacing w:after="120" w:line="360" w:lineRule="auto"/>
+      </w:pPr>
+      <w:r>
+        <w:rPr>
+          <w:sz w:val="24"/>
+          <w:szCs w:val="24"/>
+          <w:rFonts w:eastAsia="宋体" w:ascii="Times New Roman" w:hAnsi="Times New Roman"/>
+        </w:rPr>
+        <w:t xml:space="preserve">[13] 王德正：《制度同构理论视角下中国刑事管辖制度发展新路径》。</w:t>
       </w:r>
     </w:p>
     <w:sectPr>

</xml_diff>

<commit_message>
Clarify source for monitoring jurisdiction theories
Co-authored-by: LYX100 <LYX100@users.noreply.github.com>
</commit_message>
<xml_diff>
--- a/陈水桓25级法律（法学）25020070121刑事诉讼法结课论文.docx
+++ b/陈水桓25级法律（法学）25020070121刑事诉讼法结课论文.docx
@@ -1,19 +1,19 @@
 
 <file path=word/document.xml><?xml version="1.0" encoding="utf-8"?>
-<w:document xmlns:wpc="http://schemas.microsoft.com/office/word/2010/wordprocessingCanvas" xmlns:mc="http://schemas.openxmlformats.org/markup-compatibility/2006" xmlns:o="urn:schemas-microsoft-com:office:office" xmlns:r="http://schemas.openxmlformats.org/officeDocument/2006/relationships" xmlns:m="http://schemas.openxmlformats.org/officeDocument/2006/math" xmlns:v="urn:schemas-microsoft-com:vml" xmlns:wp14="http://schemas.microsoft.com/office/word/2010/wordprocessingDrawing" xmlns:wp="http://schemas.openxmlformats.org/drawingml/2006/wordprocessingDrawing" xmlns:w10="urn:schemas-microsoft-com:office:word" xmlns:w="http://schemas.openxmlformats.org/wordprocessingml/2006/main" xmlns:w14="http://schemas.microsoft.com/office/word/2010/wordml" xmlns:wpg="http://schemas.microsoft.com/office/word/2010/wordprocessingGroup" xmlns:wpi="http://schemas.microsoft.com/office/word/2010/wordprocessingInk" xmlns:wne="http://schemas.microsoft.com/office/word/2006/wordml" xmlns:wps="http://schemas.microsoft.com/office/word/2010/wordprocessingShape" mc:Ignorable="w14 wp14">
+<w:document xmlns:mc="http://schemas.openxmlformats.org/markup-compatibility/2006" xmlns:r="http://schemas.openxmlformats.org/officeDocument/2006/relationships" xmlns:w="http://schemas.openxmlformats.org/wordprocessingml/2006/main" mc:Ignorable="">
   <w:body>
     <w:p>
       <w:pPr>
         <w:jc w:val="center"/>
-        <w:spacing w:after="180" w:line="360" w:lineRule="auto"/>
-      </w:pPr>
-      <w:r>
-        <w:rPr>
-          <w:b/>
-          <w:bCs/>
-          <w:sz w:val="24"/>
-          <w:szCs w:val="24"/>
-          <w:rFonts w:eastAsia="宋体" w:ascii="Times New Roman" w:hAnsi="Times New Roman"/>
+        <w:spacing w:after="120" w:line="360" w:lineRule="auto"/>
+      </w:pPr>
+      <w:r>
+        <w:rPr>
+          <w:b/>
+          <w:bCs/>
+          <w:rFonts w:eastAsia="宋体" w:ascii="Times New Roman" w:hAnsi="Times New Roman"/>
+          <w:sz w:val="24"/>
+          <w:szCs w:val="24"/>
         </w:rPr>
         <w:t xml:space="preserve">《刑事诉讼法》课程论文</w:t>
       </w:r>
@@ -21,15 +21,15 @@
     <w:p>
       <w:pPr>
         <w:jc w:val="center"/>
-        <w:spacing w:after="180" w:line="360" w:lineRule="auto"/>
-      </w:pPr>
-      <w:r>
-        <w:rPr>
-          <w:b/>
-          <w:bCs/>
+        <w:spacing w:after="120" w:line="360" w:lineRule="auto"/>
+      </w:pPr>
+      <w:r>
+        <w:rPr>
+          <w:b/>
+          <w:bCs/>
+          <w:rFonts w:eastAsia="宋体" w:ascii="Times New Roman" w:hAnsi="Times New Roman"/>
           <w:sz w:val="26"/>
           <w:szCs w:val="26"/>
-          <w:rFonts w:eastAsia="宋体" w:ascii="Times New Roman" w:hAnsi="Times New Roman"/>
         </w:rPr>
         <w:t xml:space="preserve">题目：刑事指定管辖的程序控制研究</w:t>
       </w:r>
@@ -37,15 +37,15 @@
     <w:p>
       <w:pPr>
         <w:jc w:val="center"/>
-        <w:spacing w:after="180" w:line="360" w:lineRule="auto"/>
-      </w:pPr>
-      <w:r>
-        <w:rPr>
-          <w:b/>
-          <w:bCs/>
-          <w:sz w:val="24"/>
-          <w:szCs w:val="24"/>
-          <w:rFonts w:eastAsia="宋体" w:ascii="Times New Roman" w:hAnsi="Times New Roman"/>
+        <w:spacing w:after="120" w:line="360" w:lineRule="auto"/>
+      </w:pPr>
+      <w:r>
+        <w:rPr>
+          <w:b/>
+          <w:bCs/>
+          <w:rFonts w:eastAsia="宋体" w:ascii="Times New Roman" w:hAnsi="Times New Roman"/>
+          <w:sz w:val="24"/>
+          <w:szCs w:val="24"/>
         </w:rPr>
         <w:t xml:space="preserve">课程名称： 刑事诉讼法</w:t>
       </w:r>
@@ -53,15 +53,15 @@
     <w:p>
       <w:pPr>
         <w:jc w:val="center"/>
-        <w:spacing w:after="180" w:line="360" w:lineRule="auto"/>
-      </w:pPr>
-      <w:r>
-        <w:rPr>
-          <w:b/>
-          <w:bCs/>
-          <w:sz w:val="24"/>
-          <w:szCs w:val="24"/>
-          <w:rFonts w:eastAsia="宋体" w:ascii="Times New Roman" w:hAnsi="Times New Roman"/>
+        <w:spacing w:after="120" w:line="360" w:lineRule="auto"/>
+      </w:pPr>
+      <w:r>
+        <w:rPr>
+          <w:b/>
+          <w:bCs/>
+          <w:rFonts w:eastAsia="宋体" w:ascii="Times New Roman" w:hAnsi="Times New Roman"/>
+          <w:sz w:val="24"/>
+          <w:szCs w:val="24"/>
         </w:rPr>
         <w:t xml:space="preserve">班 级： 25法律（法学）</w:t>
       </w:r>
@@ -69,15 +69,15 @@
     <w:p>
       <w:pPr>
         <w:jc w:val="center"/>
-        <w:spacing w:after="180" w:line="360" w:lineRule="auto"/>
-      </w:pPr>
-      <w:r>
-        <w:rPr>
-          <w:b/>
-          <w:bCs/>
-          <w:sz w:val="24"/>
-          <w:szCs w:val="24"/>
-          <w:rFonts w:eastAsia="宋体" w:ascii="Times New Roman" w:hAnsi="Times New Roman"/>
+        <w:spacing w:after="120" w:line="360" w:lineRule="auto"/>
+      </w:pPr>
+      <w:r>
+        <w:rPr>
+          <w:b/>
+          <w:bCs/>
+          <w:rFonts w:eastAsia="宋体" w:ascii="Times New Roman" w:hAnsi="Times New Roman"/>
+          <w:sz w:val="24"/>
+          <w:szCs w:val="24"/>
         </w:rPr>
         <w:t xml:space="preserve">学 　 号： 25020070121</w:t>
       </w:r>
@@ -85,15 +85,15 @@
     <w:p>
       <w:pPr>
         <w:jc w:val="center"/>
-        <w:spacing w:after="180" w:line="360" w:lineRule="auto"/>
-      </w:pPr>
-      <w:r>
-        <w:rPr>
-          <w:b/>
-          <w:bCs/>
-          <w:sz w:val="24"/>
-          <w:szCs w:val="24"/>
-          <w:rFonts w:eastAsia="宋体" w:ascii="Times New Roman" w:hAnsi="Times New Roman"/>
+        <w:spacing w:after="120" w:line="360" w:lineRule="auto"/>
+      </w:pPr>
+      <w:r>
+        <w:rPr>
+          <w:b/>
+          <w:bCs/>
+          <w:rFonts w:eastAsia="宋体" w:ascii="Times New Roman" w:hAnsi="Times New Roman"/>
+          <w:sz w:val="24"/>
+          <w:szCs w:val="24"/>
         </w:rPr>
         <w:t xml:space="preserve">学生姓名： 陈水桓</w:t>
       </w:r>
@@ -101,15 +101,15 @@
     <w:p>
       <w:pPr>
         <w:jc w:val="center"/>
-        <w:spacing w:after="180" w:line="360" w:lineRule="auto"/>
-      </w:pPr>
-      <w:r>
-        <w:rPr>
-          <w:b/>
-          <w:bCs/>
-          <w:sz w:val="24"/>
-          <w:szCs w:val="24"/>
-          <w:rFonts w:eastAsia="宋体" w:ascii="Times New Roman" w:hAnsi="Times New Roman"/>
+        <w:spacing w:after="120" w:line="360" w:lineRule="auto"/>
+      </w:pPr>
+      <w:r>
+        <w:rPr>
+          <w:b/>
+          <w:bCs/>
+          <w:rFonts w:eastAsia="宋体" w:ascii="Times New Roman" w:hAnsi="Times New Roman"/>
+          <w:sz w:val="24"/>
+          <w:szCs w:val="24"/>
         </w:rPr>
         <w:t xml:space="preserve">二0二六年五月</w:t>
       </w:r>
@@ -125,15 +125,15 @@
     <w:p>
       <w:pPr>
         <w:jc w:val="center"/>
-        <w:spacing w:after="240" w:line="360" w:lineRule="auto"/>
-      </w:pPr>
-      <w:r>
-        <w:rPr>
-          <w:b/>
-          <w:bCs/>
+        <w:spacing w:after="120" w:line="360" w:lineRule="auto"/>
+      </w:pPr>
+      <w:r>
+        <w:rPr>
+          <w:b/>
+          <w:bCs/>
+          <w:rFonts w:eastAsia="宋体" w:ascii="Times New Roman" w:hAnsi="Times New Roman"/>
           <w:sz w:val="32"/>
           <w:szCs w:val="32"/>
-          <w:rFonts w:eastAsia="宋体" w:ascii="Times New Roman" w:hAnsi="Times New Roman"/>
         </w:rPr>
         <w:t xml:space="preserve">刑事指定管辖的程序控制研究</w:t>
       </w:r>
@@ -144,9 +144,9 @@
       </w:pPr>
       <w:r>
         <w:rPr>
-          <w:sz w:val="24"/>
-          <w:szCs w:val="24"/>
-          <w:rFonts w:eastAsia="宋体" w:ascii="Times New Roman" w:hAnsi="Times New Roman"/>
+          <w:rFonts w:eastAsia="宋体" w:ascii="Times New Roman" w:hAnsi="Times New Roman"/>
+          <w:sz w:val="24"/>
+          <w:szCs w:val="24"/>
         </w:rPr>
         <w:t xml:space="preserve">摘 要：刑事指定管辖原本是法定管辖不能正常发挥作用时的一种补充机制。它可以解决管辖争议，也可以在地方干扰较强、办案机关整体不宜办理案件时，将案件转交其他机关处理。但是近几年刑事司法实践中，指定管辖的功能正在发生变化：它不再只是审判阶段的例外安排，而是越来越多地出现在侦查、监察调查以及审查起诉衔接过程中。问题并不在于指定管辖本身应否存在，而在于它是否被放在了正确的位置。唐山烧烤店打人案中的异地侦查，确实回应了社会公众对本地办案公正性的疑虑；但如果这种决定缺少充分说理和救济渠道，就可能使“回应舆论”替代“依法确定管辖”。职务犯罪案件中的指定管辖也有类似问题，反腐败工作需要排除地方关系干扰，但监察指定管辖一旦当然牵引后续起诉和审判，就会改变刑事诉讼本身的管辖逻辑。本文认为，指定管辖应当回到例外制度的位置，改革重点不是简单限制指定管辖数量，而是将其纳入程序控制：明确适用理由，强化书面说理，允许被追诉人提出管辖异议，并由检察机关和法院分别承担监督、审查责任。</w:t>
       </w:r>
@@ -157,24 +157,24 @@
       </w:pPr>
       <w:r>
         <w:rPr>
-          <w:sz w:val="24"/>
-          <w:szCs w:val="24"/>
-          <w:rFonts w:eastAsia="宋体" w:ascii="Times New Roman" w:hAnsi="Times New Roman"/>
+          <w:rFonts w:eastAsia="宋体" w:ascii="Times New Roman" w:hAnsi="Times New Roman"/>
+          <w:sz w:val="24"/>
+          <w:szCs w:val="24"/>
         </w:rPr>
         <w:t xml:space="preserve">关键词：指定管辖；管辖异议；侦查管辖；监察调查；程序控制</w:t>
       </w:r>
     </w:p>
     <w:p>
       <w:pPr>
-        <w:spacing w:after="160" w:line="360" w:lineRule="auto"/>
-      </w:pPr>
-      <w:r>
-        <w:rPr>
-          <w:b/>
-          <w:bCs/>
+        <w:spacing w:after="120" w:line="360" w:lineRule="auto"/>
+      </w:pPr>
+      <w:r>
+        <w:rPr>
+          <w:b/>
+          <w:bCs/>
+          <w:rFonts w:eastAsia="宋体" w:ascii="Times New Roman" w:hAnsi="Times New Roman"/>
           <w:sz w:val="28"/>
           <w:szCs w:val="28"/>
-          <w:rFonts w:eastAsia="宋体" w:ascii="Times New Roman" w:hAnsi="Times New Roman"/>
         </w:rPr>
         <w:t xml:space="preserve">一、问题的提出：指定管辖为什么不能只被看成办案便利</w:t>
       </w:r>
@@ -186,9 +186,9 @@
       </w:pPr>
       <w:r>
         <w:rPr>
-          <w:sz w:val="24"/>
-          <w:szCs w:val="24"/>
-          <w:rFonts w:eastAsia="宋体" w:ascii="Times New Roman" w:hAnsi="Times New Roman"/>
+          <w:rFonts w:eastAsia="宋体" w:ascii="Times New Roman" w:hAnsi="Times New Roman"/>
+          <w:sz w:val="24"/>
+          <w:szCs w:val="24"/>
         </w:rPr>
         <w:t xml:space="preserve">管辖制度在刑事诉讼中常被理解为案件分配规则。按照这种理解，管辖解决的是“哪个机关办案”的问题，似乎并不直接影响案件实体结果。可是，阅读相关文献和案例后，我更倾向于认为，管辖是刑事程序的入口，入口由谁掌握，往往会影响后面一连串程序选择。</w:t>
       </w:r>
@@ -200,9 +200,9 @@
       </w:pPr>
       <w:r>
         <w:rPr>
-          <w:sz w:val="24"/>
-          <w:szCs w:val="24"/>
-          <w:rFonts w:eastAsia="宋体" w:ascii="Times New Roman" w:hAnsi="Times New Roman"/>
+          <w:rFonts w:eastAsia="宋体" w:ascii="Times New Roman" w:hAnsi="Times New Roman"/>
+          <w:sz w:val="24"/>
+          <w:szCs w:val="24"/>
         </w:rPr>
         <w:t xml:space="preserve">侦查机关取得管辖权后，可以决定由谁收集证据、在哪里讯问、怎样采取查封扣押冻结措施；检察机关取得管辖权后，决定由哪一地的检察机关审查起诉、如何与侦查机关沟通补证；法院取得管辖权后，则决定案件由哪个审判环境处理。对于被追诉人来说，这些并不是抽象的程序问题，而是会转化为会见成本、取证难度、证人出庭成本和审判中立性的现实问题。</w:t>
       </w:r>
@@ -214,9 +214,9 @@
       </w:pPr>
       <w:r>
         <w:rPr>
-          <w:sz w:val="24"/>
-          <w:szCs w:val="24"/>
-          <w:rFonts w:eastAsia="宋体" w:ascii="Times New Roman" w:hAnsi="Times New Roman"/>
+          <w:rFonts w:eastAsia="宋体" w:ascii="Times New Roman" w:hAnsi="Times New Roman"/>
+          <w:sz w:val="24"/>
+          <w:szCs w:val="24"/>
         </w:rPr>
         <w:t xml:space="preserve">唐山烧烤店打人案很能说明这一点。案件发生后，河北省公安厅指定廊坊市公安局广阳分局侦查办理。张培铮在讨论公安机关侦查指定管辖时提到，该案之所以引发关注，并不只是因为实体法上的定罪量刑问题，还因为社会公众担心本地侦查是否会受到地方因素影响。[1] 从结果看，异地侦查确实有稳定公众预期的作用。问题在于，若我们只用“社会影响大”“公众关注度高”来解释指定管辖，标准就会变得很松。一个案件舆论越大，越容易异地指定；但舆论大小本身并不是法律标准。更关键的是，指定管辖究竟是因为本地机关不宜办理，还是因为上级机关希望迅速平息舆论？这两者在效果上可能相似，在法理上却不一样。</w:t>
       </w:r>
@@ -228,24 +228,24 @@
       </w:pPr>
       <w:r>
         <w:rPr>
-          <w:sz w:val="24"/>
-          <w:szCs w:val="24"/>
-          <w:rFonts w:eastAsia="宋体" w:ascii="Times New Roman" w:hAnsi="Times New Roman"/>
+          <w:rFonts w:eastAsia="宋体" w:ascii="Times New Roman" w:hAnsi="Times New Roman"/>
+          <w:sz w:val="24"/>
+          <w:szCs w:val="24"/>
         </w:rPr>
         <w:t xml:space="preserve">这也是本文要讨论的核心问题：指定管辖不能只从“方便办案”角度理解，它还牵涉被追诉人由法定机关办理案件的程序利益。指定管辖当然不是坏制度，但它是一种改变原有管辖安排的制度。既然它改变了原先的法律分配，就需要说明为什么改变、改变到哪里、由谁监督、当事人能不能提出异议。</w:t>
       </w:r>
     </w:p>
     <w:p>
       <w:pPr>
-        <w:spacing w:after="160" w:line="360" w:lineRule="auto"/>
-      </w:pPr>
-      <w:r>
-        <w:rPr>
-          <w:b/>
-          <w:bCs/>
+        <w:spacing w:after="120" w:line="360" w:lineRule="auto"/>
+      </w:pPr>
+      <w:r>
+        <w:rPr>
+          <w:b/>
+          <w:bCs/>
+          <w:rFonts w:eastAsia="宋体" w:ascii="Times New Roman" w:hAnsi="Times New Roman"/>
           <w:sz w:val="28"/>
           <w:szCs w:val="28"/>
-          <w:rFonts w:eastAsia="宋体" w:ascii="Times New Roman" w:hAnsi="Times New Roman"/>
         </w:rPr>
         <w:t xml:space="preserve">二、两种相反观点及其不足</w:t>
       </w:r>
@@ -257,9 +257,9 @@
       </w:pPr>
       <w:r>
         <w:rPr>
-          <w:sz w:val="24"/>
-          <w:szCs w:val="24"/>
-          <w:rFonts w:eastAsia="宋体" w:ascii="Times New Roman" w:hAnsi="Times New Roman"/>
+          <w:rFonts w:eastAsia="宋体" w:ascii="Times New Roman" w:hAnsi="Times New Roman"/>
+          <w:sz w:val="24"/>
+          <w:szCs w:val="24"/>
         </w:rPr>
         <w:t xml:space="preserve">围绕刑事指定管辖，大致存在两种容易走向极端的观点。</w:t>
       </w:r>
@@ -271,9 +271,9 @@
       </w:pPr>
       <w:r>
         <w:rPr>
-          <w:sz w:val="24"/>
-          <w:szCs w:val="24"/>
-          <w:rFonts w:eastAsia="宋体" w:ascii="Times New Roman" w:hAnsi="Times New Roman"/>
+          <w:rFonts w:eastAsia="宋体" w:ascii="Times New Roman" w:hAnsi="Times New Roman"/>
+          <w:sz w:val="24"/>
+          <w:szCs w:val="24"/>
         </w:rPr>
         <w:t xml:space="preserve">一种观点偏重效率，认为刑事犯罪形态越来越复杂，网络犯罪、经济犯罪、职务犯罪经常跨地区发生，如果仍然拘泥于传统地域管辖规则，案件办理会非常困难。按照这一看法，指定管辖是一种灵活工具，可以快速解决管辖冲突，排除地方阻力，也能集中办案力量。这个观点有现实基础。比如跨区域电信诈骗案件中，犯罪行为地、被害人所在地、资金流转地可能分散在多个地方，如果所有机关都等待别人先办，追诉活动可能难以展开。</w:t>
       </w:r>
@@ -285,9 +285,9 @@
       </w:pPr>
       <w:r>
         <w:rPr>
-          <w:sz w:val="24"/>
-          <w:szCs w:val="24"/>
-          <w:rFonts w:eastAsia="宋体" w:ascii="Times New Roman" w:hAnsi="Times New Roman"/>
+          <w:rFonts w:eastAsia="宋体" w:ascii="Times New Roman" w:hAnsi="Times New Roman"/>
+          <w:sz w:val="24"/>
+          <w:szCs w:val="24"/>
         </w:rPr>
         <w:t xml:space="preserve">但效率观点的问题在于，它容易把指定管辖看成内部管理技术，而忽略被追诉人的程序位置。侦查指定管辖一旦作出，后续审查起诉和审判往往会顺着侦查地继续进行。郭烁、吴子越就指出，侦查指定管辖在实践中存在适用条件不明确、适用次数缺乏限制、监督制约机制不足等问题。[2] 这意味着，侦查阶段的一个决定，可能在事实上提前安排了案件的诉讼路线。若不加限制，所谓“便利侦查”就可能变成“侦查决定审判”。</w:t>
       </w:r>
@@ -299,9 +299,9 @@
       </w:pPr>
       <w:r>
         <w:rPr>
-          <w:sz w:val="24"/>
-          <w:szCs w:val="24"/>
-          <w:rFonts w:eastAsia="宋体" w:ascii="Times New Roman" w:hAnsi="Times New Roman"/>
+          <w:rFonts w:eastAsia="宋体" w:ascii="Times New Roman" w:hAnsi="Times New Roman"/>
+          <w:sz w:val="24"/>
+          <w:szCs w:val="24"/>
         </w:rPr>
         <w:t xml:space="preserve">另一种观点偏重权利保障，强调法定法官原则和管辖确定性，认为指定管辖是一种“人定法官”，应当尽可能压缩。这个观点提醒我们，管辖不能完全由机关事后选择，否则容易出现选择性办案。但是，如果过度强调确定性，又可能忽视我国刑事案件的复杂现实。有些案件确实存在本地机关整体不宜办理的问题。例如地方领导干部职务犯罪案件，如果被调查人在当地长期任职，案件仍由当地机关办理，社会公众很难相信程序完全不受影响。此时若完全排除指定管辖，反而不利于公正。</w:t>
       </w:r>
@@ -313,9 +313,9 @@
       </w:pPr>
       <w:r>
         <w:rPr>
-          <w:sz w:val="24"/>
-          <w:szCs w:val="24"/>
-          <w:rFonts w:eastAsia="宋体" w:ascii="Times New Roman" w:hAnsi="Times New Roman"/>
+          <w:rFonts w:eastAsia="宋体" w:ascii="Times New Roman" w:hAnsi="Times New Roman"/>
+          <w:sz w:val="24"/>
+          <w:szCs w:val="24"/>
         </w:rPr>
         <w:t xml:space="preserve">所以，比较合理的判断应当是：指定管辖可以存在，但不能成为不受审查的“快捷键”。它不是法定管辖的替代品，而是法定管辖出现障碍后的补救机制。我的理解是，判断指定管辖是否正当，不能只问“指定后办案是否更快”，还要问三个问题：原管辖机关为什么不适合继续办理？被指定机关和案件之间有没有合理联系？当事人是否有机会知道理由并提出异议？如果这三个问题都回答不清楚，指定管辖就容易滑向任意。</w:t>
       </w:r>
@@ -327,9 +327,9 @@
       </w:pPr>
       <w:r>
         <w:rPr>
-          <w:sz w:val="24"/>
-          <w:szCs w:val="24"/>
-          <w:rFonts w:eastAsia="宋体" w:ascii="Times New Roman" w:hAnsi="Times New Roman"/>
+          <w:rFonts w:eastAsia="宋体" w:ascii="Times New Roman" w:hAnsi="Times New Roman"/>
+          <w:sz w:val="24"/>
+          <w:szCs w:val="24"/>
         </w:rPr>
         <w:t xml:space="preserve">实际上，两种观点的分歧背后，是对刑事诉讼结构的不同理解。效率观点把刑事程序理解为一条追诉链条，越早确定办案机关，越有利于把案件推下去；权利观点则把刑事程序理解为国家权力逐步进入个人生活的过程，每向前推进一步，都需要说明权力来源。就指定管辖而言，我更赞同后一种视角，但并不认为它必然排斥效率。真正的问题在于，效率不能单独成为改变管辖的理由。比如“某地办案经验丰富”当然可以作为考虑因素，却不能单独支撑指定管辖；如果原管辖地不存在干扰，主要证据也在原地，仅仅因为另一地“更会办案”就改变管辖，实际上是在用行政管理逻辑替代诉讼法逻辑。</w:t>
       </w:r>
@@ -341,24 +341,24 @@
       </w:pPr>
       <w:r>
         <w:rPr>
-          <w:sz w:val="24"/>
-          <w:szCs w:val="24"/>
-          <w:rFonts w:eastAsia="宋体" w:ascii="Times New Roman" w:hAnsi="Times New Roman"/>
+          <w:rFonts w:eastAsia="宋体" w:ascii="Times New Roman" w:hAnsi="Times New Roman"/>
+          <w:sz w:val="24"/>
+          <w:szCs w:val="24"/>
         </w:rPr>
         <w:t xml:space="preserve">这里还存在一个容易被忽略的学说争议：指定管辖究竟是一种权力配置规则，还是一种权利保障规则？如果只把它看成权力配置规则，决定主体自然是上级机关，当事人只需要接受结果；如果承认它具有权利保障功能，当事人就不应被完全排除在程序之外。我的判断是，指定管辖最初也许主要服务于权力配置，但在今天的刑事诉讼中，它已经不可避免地影响被追诉人的受审地点、辩护条件和证据取得，因此必须被重新理解为兼具权力分配和权利保障双重属性的制度。只有承认这种双重属性，后面讨论听取意见、书面说理和管辖异议才不是额外负担，而是制度本身应有的内容。</w:t>
       </w:r>
     </w:p>
     <w:p>
       <w:pPr>
-        <w:spacing w:after="160" w:line="360" w:lineRule="auto"/>
-      </w:pPr>
-      <w:r>
-        <w:rPr>
-          <w:b/>
-          <w:bCs/>
+        <w:spacing w:after="120" w:line="360" w:lineRule="auto"/>
+      </w:pPr>
+      <w:r>
+        <w:rPr>
+          <w:b/>
+          <w:bCs/>
+          <w:rFonts w:eastAsia="宋体" w:ascii="Times New Roman" w:hAnsi="Times New Roman"/>
           <w:sz w:val="28"/>
           <w:szCs w:val="28"/>
-          <w:rFonts w:eastAsia="宋体" w:ascii="Times New Roman" w:hAnsi="Times New Roman"/>
         </w:rPr>
         <w:t xml:space="preserve">三、实践中最需要警惕的两个场景</w:t>
       </w:r>
@@ -370,9 +370,9 @@
       </w:pPr>
       <w:r>
         <w:rPr>
-          <w:sz w:val="24"/>
-          <w:szCs w:val="24"/>
-          <w:rFonts w:eastAsia="宋体" w:ascii="Times New Roman" w:hAnsi="Times New Roman"/>
+          <w:rFonts w:eastAsia="宋体" w:ascii="Times New Roman" w:hAnsi="Times New Roman"/>
+          <w:sz w:val="24"/>
+          <w:szCs w:val="24"/>
         </w:rPr>
         <w:t xml:space="preserve">指定管辖的问题并不是所有案件中都一样突出。相较而言，侦查阶段的异地管辖和职务犯罪中的监察指定管辖，更容易造成后续程序被提前锁定。</w:t>
       </w:r>
@@ -384,9 +384,9 @@
       </w:pPr>
       <w:r>
         <w:rPr>
-          <w:sz w:val="24"/>
-          <w:szCs w:val="24"/>
-          <w:rFonts w:eastAsia="宋体" w:ascii="Times New Roman" w:hAnsi="Times New Roman"/>
+          <w:rFonts w:eastAsia="宋体" w:ascii="Times New Roman" w:hAnsi="Times New Roman"/>
+          <w:sz w:val="24"/>
+          <w:szCs w:val="24"/>
         </w:rPr>
         <w:t xml:space="preserve">先看侦查阶段的异地管辖。近年来“远洋捕捞”式执法受到社会关注，背后有经济下行压力、地方财政压力、涉案财物返还机制等复杂原因。蔡元培在讨论刑事诉讼移送管辖时指出，管辖制度失灵是异地趋利执法频发的重要原因之一。[3] 这一判断我认为比较准确。许多涉企案件并不是没有任何地域连接点，而是连接点很弱，比如资金经过某地账户、某地有少数被害人、服务器或平台节点与某地有关。办案机关如果据此立案，并迅速查封外地企业财物，后续即使发现主要犯罪地并不在本地，也很难轻易移送。</w:t>
       </w:r>
@@ -398,9 +398,9 @@
       </w:pPr>
       <w:r>
         <w:rPr>
-          <w:sz w:val="24"/>
-          <w:szCs w:val="24"/>
-          <w:rFonts w:eastAsia="宋体" w:ascii="Times New Roman" w:hAnsi="Times New Roman"/>
+          <w:rFonts w:eastAsia="宋体" w:ascii="Times New Roman" w:hAnsi="Times New Roman"/>
+          <w:sz w:val="24"/>
+          <w:szCs w:val="24"/>
         </w:rPr>
         <w:t xml:space="preserve">值得注意的是，“远洋捕捞”的争议焦点往往不在于异地办案本身是否绝对违法，而在于管辖连接点是否足够实质。法院或司法机关在处理这类争议时，真正需要说明的不是“本机关是否也能找到一个连接点”，而是“这个连接点为什么足以支撑本机关作为主要办案机关”。如果只要有一点资金流、信息流、被害人所在地联系，就可以启动完整刑事追诉，那么犯罪地管辖就会被无限扩张。我的看法是，涉企案件中判断管辖，应当更重视主要犯罪行为地、主要结果发生地和主要证据所在地，而不是把任何弱连接点都解释为管辖根据。</w:t>
       </w:r>
@@ -412,9 +412,9 @@
       </w:pPr>
       <w:r>
         <w:rPr>
-          <w:sz w:val="24"/>
-          <w:szCs w:val="24"/>
-          <w:rFonts w:eastAsia="宋体" w:ascii="Times New Roman" w:hAnsi="Times New Roman"/>
+          <w:rFonts w:eastAsia="宋体" w:ascii="Times New Roman" w:hAnsi="Times New Roman"/>
+          <w:sz w:val="24"/>
+          <w:szCs w:val="24"/>
         </w:rPr>
         <w:t xml:space="preserve">这一问题还有明显的时代背景。近几年，规范涉企执法、防止利用刑事手段干预经济纠纷被反复强调，原因在于刑事立案、查封扣押冻结一旦进入企业经营活动，影响往往不是单个案件内部可以消化的。企业账户被冻结，员工工资、供应商货款、贷款偿还都会受到影响。也就是说，管辖选择在涉企案件中不只是“由谁办案”，还可能决定一家企业是否还能正常运转。若办案机关在弱连接点基础上取得管辖，并以刑事程序控制异地财物，即使最后案件被纠正，企业经营损害也可能已经发生。</w:t>
       </w:r>
@@ -426,9 +426,9 @@
       </w:pPr>
       <w:r>
         <w:rPr>
-          <w:sz w:val="24"/>
-          <w:szCs w:val="24"/>
-          <w:rFonts w:eastAsia="宋体" w:ascii="Times New Roman" w:hAnsi="Times New Roman"/>
+          <w:rFonts w:eastAsia="宋体" w:ascii="Times New Roman" w:hAnsi="Times New Roman"/>
+          <w:sz w:val="24"/>
+          <w:szCs w:val="24"/>
         </w:rPr>
         <w:t xml:space="preserve">从法院或检察机关的审查逻辑看，这类案件不能只审查形式上有没有犯罪地连接，还要审查连接点与案件核心事实之间的距离。例如，某地只有一名被害人报案，或者某笔资金短暂停留，是否足以压倒主要经营地、主要合同履行地、主要证据所在地？如果答案是否定的，就应当通过移送管辖或者检察监督尽早调整。这里我不赞成把所有异地办案都贴上“远洋捕捞”的标签，因为跨区域犯罪确实需要跨区域追诉；但我也不赞成只要有司法解释上的连接点，就认为办案机关天然正当。管辖判断应当有强弱之分，而不是有无之分。</w:t>
       </w:r>
@@ -440,9 +440,9 @@
       </w:pPr>
       <w:r>
         <w:rPr>
-          <w:sz w:val="24"/>
-          <w:szCs w:val="24"/>
-          <w:rFonts w:eastAsia="宋体" w:ascii="Times New Roman" w:hAnsi="Times New Roman"/>
+          <w:rFonts w:eastAsia="宋体" w:ascii="Times New Roman" w:hAnsi="Times New Roman"/>
+          <w:sz w:val="24"/>
+          <w:szCs w:val="24"/>
         </w:rPr>
         <w:t xml:space="preserve">再看职务犯罪案件。监察调查指定管辖的合理性更容易被接受，因为职务犯罪往往牵涉地方权力关系。问题在于，监察管辖的逻辑和刑事诉讼管辖的逻辑并不一致。监察管辖更多围绕干部管理权限展开，刑事诉讼管辖则要考虑案件性质、可能判处刑罚、犯罪地和审级利益。卢少锋、秦景琦通过判决书样本发现，监察机关指定管辖后，被指定监察机关调查完毕再移送本地同级检察机关的情形占比较高。[4] 这说明监察阶段的管辖安排，很容易向审查起诉、审判阶段延伸。</w:t>
       </w:r>
@@ -454,9 +454,9 @@
       </w:pPr>
       <w:r>
         <w:rPr>
-          <w:sz w:val="24"/>
-          <w:szCs w:val="24"/>
-          <w:rFonts w:eastAsia="宋体" w:ascii="Times New Roman" w:hAnsi="Times New Roman"/>
+          <w:rFonts w:eastAsia="宋体" w:ascii="Times New Roman" w:hAnsi="Times New Roman"/>
+          <w:sz w:val="24"/>
+          <w:szCs w:val="24"/>
         </w:rPr>
         <w:t xml:space="preserve">陈修勇的实证研究进一步显示，在其统计的最高检2018年至2023年通报样本中，职务犯罪指定司法管辖比例很高，并且出现了“常办单位”、指定管辖地相对集中等现象。[5] 这个现象值得重视。表面上看，集中指定给办案经验丰富的地方，有利于提高办案质量；但反过来看，如果某些地方长期成为职务犯罪案件的“常办单位”，指定管辖就不再像随机排除地方干扰，更像形成了一套稳定的办案分工。实际上，这已经偏离了指定管辖作为例外通道的属性。</w:t>
       </w:r>
@@ -468,9 +468,9 @@
       </w:pPr>
       <w:r>
         <w:rPr>
-          <w:sz w:val="24"/>
-          <w:szCs w:val="24"/>
-          <w:rFonts w:eastAsia="宋体" w:ascii="Times New Roman" w:hAnsi="Times New Roman"/>
+          <w:rFonts w:eastAsia="宋体" w:ascii="Times New Roman" w:hAnsi="Times New Roman"/>
+          <w:sz w:val="24"/>
+          <w:szCs w:val="24"/>
         </w:rPr>
         <w:t xml:space="preserve">在我看来，职务犯罪指定管辖最需要处理的是“调查便利”和“审判管辖”之间的边界。监察机关为了排除地方干扰，可以指定异地调查；但案件进入刑事诉讼后，检察机关和法院不能只是接续监察机关的安排。比如“大官小案”中，被调查人级别较高，但案件本身依法可能属于基层法院管辖，如果仍然因为身份级别而推高审判层级，就会改变刑事诉讼的级别管辖逻辑。反过来，“小官大案”也不能因为调查机关层级低，就忽视案件严重程度。问题不在于监察机关是否可以指定，而在于监察指定不能当然决定刑事审判管辖。</w:t>
       </w:r>
@@ -482,38 +482,38 @@
       </w:pPr>
       <w:r>
         <w:rPr>
-          <w:sz w:val="24"/>
-          <w:szCs w:val="24"/>
-          <w:rFonts w:eastAsia="宋体" w:ascii="Times New Roman" w:hAnsi="Times New Roman"/>
-        </w:rPr>
-        <w:t xml:space="preserve">关于这一点，学界其实存在不同方案。有观点主张维持现状，理由是职务犯罪案件政治敏感性强，监察机关最了解案件背景，由其主导衔接更有效率。这个观点的优势在于看到了反腐败案件的特殊性，但问题也很明显：如果监察机关的指定结果自然延伸到检察院和法院，刑事诉讼中的分工制约就会被削弱。另一种观点主张案件调查终结后原则上回到犯罪地或者原管辖地诉审，只有在确有地方干扰时才继续异地办理。这个方案更尊重刑事诉讼管辖规则，但在重大职务犯罪案件中，回流原地可能重新激活地方关系网络，现实操作未必顺畅。</w:t>
-      </w:r>
-    </w:p>
-    <w:p>
-      <w:pPr>
-        <w:ind w:firstLineChars="200"/>
-        <w:spacing w:after="120" w:line="360" w:lineRule="auto"/>
-      </w:pPr>
-      <w:r>
-        <w:rPr>
-          <w:sz w:val="24"/>
-          <w:szCs w:val="24"/>
-          <w:rFonts w:eastAsia="宋体" w:ascii="Times New Roman" w:hAnsi="Times New Roman"/>
+          <w:rFonts w:eastAsia="宋体" w:ascii="Times New Roman" w:hAnsi="Times New Roman"/>
+          <w:sz w:val="24"/>
+          <w:szCs w:val="24"/>
+        </w:rPr>
+        <w:t xml:space="preserve">关于这一点，周长军、韩晗将相关争议概括为“审判管辖统一说”与“维持现状说”，并进一步梳理了“特殊审判管辖说”“异地法官当地审说”，以及实务中的“就地同级诉审模式”“回转本地诉审模式”。本文前述所谓“维持现状”并不是某位学者的原话，而是对该文中“维持现状说”及实务中就地同级诉审模式的概括：其基本考虑是承认监察调查的特殊性，通过指定管辖和机关协调维持办案效率。这个观点的优势在于看到了反腐败案件的现实阻力，但问题也很明显：如果监察机关的指定结果自然延伸到检察院和法院，刑事诉讼中的分工制约就会被削弱。另一种更接近“回转本地诉审模式”的方案，则主张案件调查终结后原则上回到有干部管理权限或者原管辖地对应的检法机关诉审，例外时才在调查地继续诉审。这个方案更尊重刑事诉讼管辖规则，但在重大职务犯罪案件中，回流原地可能重新激活地方关系网络，现实操作未必顺畅。[11]</w:t>
+      </w:r>
+    </w:p>
+    <w:p>
+      <w:pPr>
+        <w:ind w:firstLineChars="200"/>
+        <w:spacing w:after="120" w:line="360" w:lineRule="auto"/>
+      </w:pPr>
+      <w:r>
+        <w:rPr>
+          <w:rFonts w:eastAsia="宋体" w:ascii="Times New Roman" w:hAnsi="Times New Roman"/>
+          <w:sz w:val="24"/>
+          <w:szCs w:val="24"/>
         </w:rPr>
         <w:t xml:space="preserve">我更倾向于折中方案：监察调查阶段可以为了排除干扰而指定异地，但移送审查起诉时必须重新进行一次刑事诉讼管辖审查。这个审查不应只是形式上看“是否同级对应”，还应判断案件本身依法应由哪一级法院审判、主要证据和证人在哪里、被指定地与案件有没有最低限度联系。如果继续异地起诉审判，应当说明理由；如果没有继续异地的必要，就应当依法移送或者重新指定。这意味着监察机关可以决定调查安排，却不能独自决定刑事审判场域。</w:t>
       </w:r>
     </w:p>
     <w:p>
       <w:pPr>
-        <w:spacing w:after="160" w:line="360" w:lineRule="auto"/>
-      </w:pPr>
-      <w:r>
-        <w:rPr>
-          <w:b/>
-          <w:bCs/>
+        <w:spacing w:after="120" w:line="360" w:lineRule="auto"/>
+      </w:pPr>
+      <w:r>
+        <w:rPr>
+          <w:b/>
+          <w:bCs/>
+          <w:rFonts w:eastAsia="宋体" w:ascii="Times New Roman" w:hAnsi="Times New Roman"/>
           <w:sz w:val="28"/>
           <w:szCs w:val="28"/>
-          <w:rFonts w:eastAsia="宋体" w:ascii="Times New Roman" w:hAnsi="Times New Roman"/>
         </w:rPr>
         <w:t xml:space="preserve">四、从王成忠案看管辖异议的真实功能</w:t>
       </w:r>
@@ -525,9 +525,9 @@
       </w:pPr>
       <w:r>
         <w:rPr>
-          <w:sz w:val="24"/>
-          <w:szCs w:val="24"/>
-          <w:rFonts w:eastAsia="宋体" w:ascii="Times New Roman" w:hAnsi="Times New Roman"/>
+          <w:rFonts w:eastAsia="宋体" w:ascii="Times New Roman" w:hAnsi="Times New Roman"/>
+          <w:sz w:val="24"/>
+          <w:szCs w:val="24"/>
         </w:rPr>
         <w:t xml:space="preserve">讨论管辖权异议时，最容易出现一种误解：认为这是律师拖延诉讼的策略。确实，任何程序权利都可能被滥用，但不能因为可能滥用，就否定制度本身的价值。</w:t>
       </w:r>
@@ -539,9 +539,9 @@
       </w:pPr>
       <w:r>
         <w:rPr>
-          <w:sz w:val="24"/>
-          <w:szCs w:val="24"/>
-          <w:rFonts w:eastAsia="宋体" w:ascii="Times New Roman" w:hAnsi="Times New Roman"/>
+          <w:rFonts w:eastAsia="宋体" w:ascii="Times New Roman" w:hAnsi="Times New Roman"/>
+          <w:sz w:val="24"/>
+          <w:szCs w:val="24"/>
         </w:rPr>
         <w:t xml:space="preserve">王成忠案可以作为观察入口。徐昕在讨论程序辩护时提到，吉林王成忠案中，辽源中院刑二庭庭长审理民三庭庭长，辩护人在庭审直播中提出回避问题，后来吉林高院指定通化中院管辖。[6] 这个案件的争议焦点并不只是某个法官个人是否应当回避，而是原审法院整体是否适合审理本院相关人员案件。传统回避制度主要处理法官个人与案件的利害关系，但当案件牵涉法院内部人员、法院整体形象和同事情感时，单个法官回避未必足够。</w:t>
       </w:r>
@@ -553,9 +553,9 @@
       </w:pPr>
       <w:r>
         <w:rPr>
-          <w:sz w:val="24"/>
-          <w:szCs w:val="24"/>
-          <w:rFonts w:eastAsia="宋体" w:ascii="Times New Roman" w:hAnsi="Times New Roman"/>
+          <w:rFonts w:eastAsia="宋体" w:ascii="Times New Roman" w:hAnsi="Times New Roman"/>
+          <w:sz w:val="24"/>
+          <w:szCs w:val="24"/>
         </w:rPr>
         <w:t xml:space="preserve">法院后来通过指定管辖处理该案，我认为是合理的。它实际上承认了一个问题：有些案件中的公正疑虑不是来自某个审判人员，而是来自整个审判环境。此时，如果仍然要求被告人只能申请个别法官回避，就无法触及真正的问题。指定管辖在这里起到的作用，不是为了办案方便，而是替代了我国刑事诉讼中尚未充分展开的“整体回避”功能。</w:t>
       </w:r>
@@ -567,9 +567,9 @@
       </w:pPr>
       <w:r>
         <w:rPr>
-          <w:sz w:val="24"/>
-          <w:szCs w:val="24"/>
-          <w:rFonts w:eastAsia="宋体" w:ascii="Times New Roman" w:hAnsi="Times New Roman"/>
+          <w:rFonts w:eastAsia="宋体" w:ascii="Times New Roman" w:hAnsi="Times New Roman"/>
+          <w:sz w:val="24"/>
+          <w:szCs w:val="24"/>
         </w:rPr>
         <w:t xml:space="preserve">从争议焦点看，王成忠案中最难处理的不是“审判长个人是否认识被告人”，而是法院内部长期共同工作关系是否会让外界产生合理怀疑。传统回避制度可以处理法官与案件、当事人之间的具体利害关系，却很难处理一个法院整体陷入尴尬位置的情形。吉林高院后来指定通化中院管辖，背后的法律逻辑应当是：审判中立不仅要求实际没有偏私，也要求程序外观上足以让人相信没有偏私。我的评价是，这种处理没有突破刑事诉讼法的基本框架，反而是在现有回避制度不足的情况下，用指定管辖补上了整体回避的空缺。</w:t>
       </w:r>
@@ -581,9 +581,9 @@
       </w:pPr>
       <w:r>
         <w:rPr>
-          <w:sz w:val="24"/>
-          <w:szCs w:val="24"/>
-          <w:rFonts w:eastAsia="宋体" w:ascii="Times New Roman" w:hAnsi="Times New Roman"/>
+          <w:rFonts w:eastAsia="宋体" w:ascii="Times New Roman" w:hAnsi="Times New Roman"/>
+          <w:sz w:val="24"/>
+          <w:szCs w:val="24"/>
         </w:rPr>
         <w:t xml:space="preserve">不过，这个案件也暴露出制度不足。合理的程序不应依赖庭审直播、社会关注或者辩护人的强力推动，才被上级法院纠正。更稳妥的制度应当允许被告人及辩护人在审判前提出管辖异议，法院必须以书面形式处理；如果异议涉及本院整体不宜审理，还应当报请上级法院决定。这样，管辖异议就不是临场对抗，而是正常的程序审查。</w:t>
       </w:r>
@@ -595,24 +595,24 @@
       </w:pPr>
       <w:r>
         <w:rPr>
-          <w:sz w:val="24"/>
-          <w:szCs w:val="24"/>
-          <w:rFonts w:eastAsia="宋体" w:ascii="Times New Roman" w:hAnsi="Times New Roman"/>
+          <w:rFonts w:eastAsia="宋体" w:ascii="Times New Roman" w:hAnsi="Times New Roman"/>
+          <w:sz w:val="24"/>
+          <w:szCs w:val="24"/>
         </w:rPr>
         <w:t xml:space="preserve">周涛把刑事审判管辖异议理解为基于辩护权产生的诉讼请求，这一点我赞同。[7] 但我还想补充一点：管辖异议不仅是被告人的辩护权，也是法院保护自身中立形象的工具。法院如果主动、及时处理管辖疑问，反而能减少外界对“自己人审自己人”“地方保护”的怀疑。</w:t>
       </w:r>
     </w:p>
     <w:p>
       <w:pPr>
-        <w:spacing w:after="160" w:line="360" w:lineRule="auto"/>
-      </w:pPr>
-      <w:r>
-        <w:rPr>
-          <w:b/>
-          <w:bCs/>
+        <w:spacing w:after="120" w:line="360" w:lineRule="auto"/>
+      </w:pPr>
+      <w:r>
+        <w:rPr>
+          <w:b/>
+          <w:bCs/>
+          <w:rFonts w:eastAsia="宋体" w:ascii="Times New Roman" w:hAnsi="Times New Roman"/>
           <w:sz w:val="28"/>
           <w:szCs w:val="28"/>
-          <w:rFonts w:eastAsia="宋体" w:ascii="Times New Roman" w:hAnsi="Times New Roman"/>
         </w:rPr>
         <w:t xml:space="preserve">五、制度完善不宜过于工整，关键是抓住几个节点</w:t>
       </w:r>
@@ -624,9 +624,9 @@
       </w:pPr>
       <w:r>
         <w:rPr>
-          <w:sz w:val="24"/>
-          <w:szCs w:val="24"/>
-          <w:rFonts w:eastAsia="宋体" w:ascii="Times New Roman" w:hAnsi="Times New Roman"/>
+          <w:rFonts w:eastAsia="宋体" w:ascii="Times New Roman" w:hAnsi="Times New Roman"/>
+          <w:sz w:val="24"/>
+          <w:szCs w:val="24"/>
         </w:rPr>
         <w:t xml:space="preserve">如果把所有问题都列成整齐的制度清单，反而容易忽略真正关键的地方。刑事指定管辖的改革，我认为不需要设计过于复杂的程序，而应抓住几个能改变实际运行逻辑的节点。</w:t>
       </w:r>
@@ -638,9 +638,9 @@
       </w:pPr>
       <w:r>
         <w:rPr>
-          <w:sz w:val="24"/>
-          <w:szCs w:val="24"/>
-          <w:rFonts w:eastAsia="宋体" w:ascii="Times New Roman" w:hAnsi="Times New Roman"/>
+          <w:rFonts w:eastAsia="宋体" w:ascii="Times New Roman" w:hAnsi="Times New Roman"/>
+          <w:sz w:val="24"/>
+          <w:szCs w:val="24"/>
         </w:rPr>
         <w:t xml:space="preserve">第一个节点是理由公开。指定管辖决定不能只写“情况特殊”“更为适宜”。至少应当说明原管辖机关为什么不适合办理，被指定机关为什么适合办理，案件主要证据、主要犯罪地、被害人所在地等因素如何考虑。这里的公开不一定是向社会完全公开，但至少应当向当事人和辩护人说明。没有理由的指定管辖，本质上很难被审查。</w:t>
       </w:r>
@@ -652,9 +652,9 @@
       </w:pPr>
       <w:r>
         <w:rPr>
-          <w:sz w:val="24"/>
-          <w:szCs w:val="24"/>
-          <w:rFonts w:eastAsia="宋体" w:ascii="Times New Roman" w:hAnsi="Times New Roman"/>
+          <w:rFonts w:eastAsia="宋体" w:ascii="Times New Roman" w:hAnsi="Times New Roman"/>
+          <w:sz w:val="24"/>
+          <w:szCs w:val="24"/>
         </w:rPr>
         <w:t xml:space="preserve">第二个节点是移送管辖优先。很多案件并不需要上级机关直接指定，而是原办案机关发现不适合管辖后，移送给主要犯罪地或者更适合的机关。移送管辖比指定管辖的行政色彩更弱，也更接近自我纠错。蔡元培主张重构移送管辖制度，并强调其纠正管辖错误、替代集体回避和兼顾诉讼便利的功能。[8] 这一思路可以吸收。尤其在涉企案件中，如果主要犯罪地和主要证据都在企业所在地，外地机关仅凭弱连接点立案后拒不移送，就应当受到检察监督。</w:t>
       </w:r>
@@ -666,9 +666,9 @@
       </w:pPr>
       <w:r>
         <w:rPr>
-          <w:sz w:val="24"/>
-          <w:szCs w:val="24"/>
-          <w:rFonts w:eastAsia="宋体" w:ascii="Times New Roman" w:hAnsi="Times New Roman"/>
+          <w:rFonts w:eastAsia="宋体" w:ascii="Times New Roman" w:hAnsi="Times New Roman"/>
+          <w:sz w:val="24"/>
+          <w:szCs w:val="24"/>
         </w:rPr>
         <w:t xml:space="preserve">第三个节点是分阶段异议。李昀遥主张刑事管辖权异议不应限于审判阶段，而应覆盖立案、侦查、审查起诉和审判全过程。[9] 这个观点看起来会增加程序负担，但实际上有其道理。管辖错误越早纠正，成本越低。等案件进入审判后再处理，侦查、起诉、羁押、涉案财物处置都已经完成，法院即使发现问题，也会面临很大的纠错压力。所以，侦查阶段应允许犯罪嫌疑人和辩护人向作出指定决定的上级机关提出异议，同时可以申请检察机关监督；审查起诉阶段由检察机关审查起诉管辖是否与审判管辖对应；审判阶段则由法院实质处理管辖异议。</w:t>
       </w:r>
@@ -680,9 +680,9 @@
       </w:pPr>
       <w:r>
         <w:rPr>
-          <w:sz w:val="24"/>
-          <w:szCs w:val="24"/>
-          <w:rFonts w:eastAsia="宋体" w:ascii="Times New Roman" w:hAnsi="Times New Roman"/>
+          <w:rFonts w:eastAsia="宋体" w:ascii="Times New Roman" w:hAnsi="Times New Roman"/>
+          <w:sz w:val="24"/>
+          <w:szCs w:val="24"/>
         </w:rPr>
         <w:t xml:space="preserve">第四个节点是后果区分。管辖错误不能一概导致程序无效，否则会造成过高的制度成本；但也不能完全没有后果，否则管辖异议就没有意义。比较可行的做法是区分轻重：一般管辖瑕疵，如果没有影响被追诉人权利和案件公正，可以移送后继续使用已经合法取得的证据；如果是明显无管辖权、恶意争抢管辖、借指定管辖规避强制措施条件，则应确认相关程序违法，对违法取得的证据、强制措施和涉案财物处理分别评价。</w:t>
       </w:r>
@@ -694,9 +694,9 @@
       </w:pPr>
       <w:r>
         <w:rPr>
-          <w:sz w:val="24"/>
-          <w:szCs w:val="24"/>
-          <w:rFonts w:eastAsia="宋体" w:ascii="Times New Roman" w:hAnsi="Times New Roman"/>
+          <w:rFonts w:eastAsia="宋体" w:ascii="Times New Roman" w:hAnsi="Times New Roman"/>
+          <w:sz w:val="24"/>
+          <w:szCs w:val="24"/>
         </w:rPr>
         <w:t xml:space="preserve">最后还要强调审判管辖的最终审查。谢小剑提出审查起诉地域管辖应与审判地域管辖相对应，而不能简单由侦查管辖决定。[10] 这个判断放在整个指定管辖制度中同样成立。刑事诉讼最终由法院审判，法院不能只是承接侦查机关或监察机关已经形成的管辖结果。案件到达法院后，法院仍应主动审查本院是否依法具有管辖权；被告人提出异议时，也应作出实质回应，而不是把“已经指定管辖”当成无需审查的理由。</w:t>
       </w:r>
@@ -708,9 +708,9 @@
       </w:pPr>
       <w:r>
         <w:rPr>
-          <w:sz w:val="24"/>
-          <w:szCs w:val="24"/>
-          <w:rFonts w:eastAsia="宋体" w:ascii="Times New Roman" w:hAnsi="Times New Roman"/>
+          <w:rFonts w:eastAsia="宋体" w:ascii="Times New Roman" w:hAnsi="Times New Roman"/>
+          <w:sz w:val="24"/>
+          <w:szCs w:val="24"/>
         </w:rPr>
         <w:t xml:space="preserve">还有一个更棘手的问题：如果管辖确实错误，已经取得的证据和已经作出的强制措施怎么办？这里同样有两种倾向。一种意见主张“原则有效”，认为管辖错误只是机关之间的分工错误，只要证据内容真实、取证方式没有刑讯逼供等严重违法，就不应轻易否定既有程序。这个观点考虑到了诉讼效率，也避免案件因为管辖瑕疵全部推倒重来。另一种意见则强调程序制裁，认为没有管辖权的机关本来就不应启动侦查，其取得的证据、采取的强制措施都存在主体不适格问题，如果不设置无效后果，管辖规则就会变成没有牙齿的规范。</w:t>
       </w:r>
@@ -722,9 +722,9 @@
       </w:pPr>
       <w:r>
         <w:rPr>
-          <w:sz w:val="24"/>
-          <w:szCs w:val="24"/>
-          <w:rFonts w:eastAsia="宋体" w:ascii="Times New Roman" w:hAnsi="Times New Roman"/>
+          <w:rFonts w:eastAsia="宋体" w:ascii="Times New Roman" w:hAnsi="Times New Roman"/>
+          <w:sz w:val="24"/>
+          <w:szCs w:val="24"/>
         </w:rPr>
         <w:t xml:space="preserve">我认为两种观点都不能直接照搬。完全有效说会让违法管辖没有成本，办案机关即使抢先立案、异地查封，也可以在事后说“不影响证据真实性”；但绝对无效说也会带来另一种风险，即轻微管辖判断错误导致案件整体重来，反而可能让复杂案件陷入程序空转。比较合适的做法，是把管辖错误分成不同层次处理。对于法律边界确实模糊、办案机关存在合理认识错误的案件，可以保留已经合法取得的客观证据，但应及时移送有管辖权机关；对于明知没有主要连接点仍强行立案、借指定管辖规避羁押条件、或者以控制涉案财物为主要目的的案件，就应当确认相关强制措施违法，并对由此取得的证据进行更严格审查。</w:t>
       </w:r>
@@ -736,24 +736,24 @@
       </w:pPr>
       <w:r>
         <w:rPr>
-          <w:sz w:val="24"/>
-          <w:szCs w:val="24"/>
-          <w:rFonts w:eastAsia="宋体" w:ascii="Times New Roman" w:hAnsi="Times New Roman"/>
+          <w:rFonts w:eastAsia="宋体" w:ascii="Times New Roman" w:hAnsi="Times New Roman"/>
+          <w:sz w:val="24"/>
+          <w:szCs w:val="24"/>
         </w:rPr>
         <w:t xml:space="preserve">这套区分的关键不是为了宽纵办案机关，而是让程序后果和违法程度相匹配。刑事诉讼中的程序制裁如果过轻，无法约束权力；如果过重，又可能牺牲实体查明。管辖制度尤其如此。它不像非法证据排除那样只针对某一次取证行为，而是关系整个案件由谁启动。正因为影响范围更大，才更需要精细判断。我的看法是，法院在审查管辖异议时，应当把办案机关选择管辖地的理由写入裁判说理：如果认为异议不成立，应说明案件与本地的实质连接；如果认为异议成立，也应说明已经进行的程序哪些保留、哪些撤销。这样处理虽然会增加一些工作量，但比简单驳回或者全部推倒重来更符合刑事诉讼的现实。</w:t>
       </w:r>
     </w:p>
     <w:p>
       <w:pPr>
-        <w:spacing w:after="160" w:line="360" w:lineRule="auto"/>
-      </w:pPr>
-      <w:r>
-        <w:rPr>
-          <w:b/>
-          <w:bCs/>
+        <w:spacing w:after="120" w:line="360" w:lineRule="auto"/>
+      </w:pPr>
+      <w:r>
+        <w:rPr>
+          <w:b/>
+          <w:bCs/>
+          <w:rFonts w:eastAsia="宋体" w:ascii="Times New Roman" w:hAnsi="Times New Roman"/>
           <w:sz w:val="28"/>
           <w:szCs w:val="28"/>
-          <w:rFonts w:eastAsia="宋体" w:ascii="Times New Roman" w:hAnsi="Times New Roman"/>
         </w:rPr>
         <w:t xml:space="preserve">六、结论</w:t>
       </w:r>
@@ -765,9 +765,9 @@
       </w:pPr>
       <w:r>
         <w:rPr>
-          <w:sz w:val="24"/>
-          <w:szCs w:val="24"/>
-          <w:rFonts w:eastAsia="宋体" w:ascii="Times New Roman" w:hAnsi="Times New Roman"/>
+          <w:rFonts w:eastAsia="宋体" w:ascii="Times New Roman" w:hAnsi="Times New Roman"/>
+          <w:sz w:val="24"/>
+          <w:szCs w:val="24"/>
         </w:rPr>
         <w:t xml:space="preserve">刑事指定管辖并不是一个可以简单肯定或否定的制度。它在唐山烧烤店打人案这类社会关注案件中，能够回应公众对地方办案公正性的担忧；在职务犯罪案件中，也能减少被调查人地方关系对案件处理的影响。但同一个制度也可能被滥用：侦查阶段的指定可能提前锁定后续诉讼路线，监察阶段的指定可能牵引刑事审判管辖，涉企案件中的弱连接点管辖则可能演化为趋利性执法。</w:t>
       </w:r>
@@ -779,9 +779,9 @@
       </w:pPr>
       <w:r>
         <w:rPr>
-          <w:sz w:val="24"/>
-          <w:szCs w:val="24"/>
-          <w:rFonts w:eastAsia="宋体" w:ascii="Times New Roman" w:hAnsi="Times New Roman"/>
+          <w:rFonts w:eastAsia="宋体" w:ascii="Times New Roman" w:hAnsi="Times New Roman"/>
+          <w:sz w:val="24"/>
+          <w:szCs w:val="24"/>
         </w:rPr>
         <w:t xml:space="preserve">因此，本文的基本判断是：指定管辖要保留，但必须被程序化。所谓程序化，不是把制度写得更复杂，而是让指定管辖决定有理由、能被看见、可以被异议、能够被监督。具体而言，侦查指定管辖要接受检察监督，监察指定管辖不能当然预决刑事诉讼管辖，审判阶段要允许被告方提出实质性管辖异议。对于严重违反管辖规则的案件，还应当设置相应程序后果。</w:t>
       </w:r>
@@ -793,24 +793,24 @@
       </w:pPr>
       <w:r>
         <w:rPr>
-          <w:sz w:val="24"/>
-          <w:szCs w:val="24"/>
-          <w:rFonts w:eastAsia="宋体" w:ascii="Times New Roman" w:hAnsi="Times New Roman"/>
+          <w:rFonts w:eastAsia="宋体" w:ascii="Times New Roman" w:hAnsi="Times New Roman"/>
+          <w:sz w:val="24"/>
+          <w:szCs w:val="24"/>
         </w:rPr>
         <w:t xml:space="preserve">管辖制度的价值，不在于让案件被更快地分出去，而在于让案件进入一个更正当的程序。指定管辖如果只是为了方便办案，它就会不断扩张；如果被理解为法定管辖失灵时的有限补救，它才能真正服务于刑事诉讼的公正。</w:t>
       </w:r>
     </w:p>
     <w:p>
       <w:pPr>
-        <w:spacing w:after="160" w:line="360" w:lineRule="auto"/>
-      </w:pPr>
-      <w:r>
-        <w:rPr>
-          <w:b/>
-          <w:bCs/>
+        <w:spacing w:after="120" w:line="360" w:lineRule="auto"/>
+      </w:pPr>
+      <w:r>
+        <w:rPr>
+          <w:b/>
+          <w:bCs/>
+          <w:rFonts w:eastAsia="宋体" w:ascii="Times New Roman" w:hAnsi="Times New Roman"/>
           <w:sz w:val="28"/>
           <w:szCs w:val="28"/>
-          <w:rFonts w:eastAsia="宋体" w:ascii="Times New Roman" w:hAnsi="Times New Roman"/>
         </w:rPr>
         <w:t xml:space="preserve">注释</w:t>
       </w:r>
@@ -821,128 +821,141 @@
       </w:pPr>
       <w:r>
         <w:rPr>
-          <w:sz w:val="22"/>
-          <w:szCs w:val="22"/>
-          <w:rFonts w:eastAsia="宋体" w:ascii="Times New Roman" w:hAnsi="Times New Roman"/>
-        </w:rPr>
-        <w:t xml:space="preserve">1. 张培铮：《论公安机关侦查指定管辖》，载《湖南警察学院学报》2022年第5期，第67—68页。</w:t>
-      </w:r>
-    </w:p>
-    <w:p>
-      <w:pPr>
-        <w:spacing w:after="120" w:line="360" w:lineRule="auto"/>
-      </w:pPr>
-      <w:r>
-        <w:rPr>
-          <w:sz w:val="22"/>
-          <w:szCs w:val="22"/>
-          <w:rFonts w:eastAsia="宋体" w:ascii="Times New Roman" w:hAnsi="Times New Roman"/>
-        </w:rPr>
-        <w:t xml:space="preserve">2. 郭烁、吴子越：《从“工具导向”到“权利本位”：侦查指定管辖的性质校准》，载《人民检察》2024年第11期，第13—18页。</w:t>
-      </w:r>
-    </w:p>
-    <w:p>
-      <w:pPr>
-        <w:spacing w:after="120" w:line="360" w:lineRule="auto"/>
-      </w:pPr>
-      <w:r>
-        <w:rPr>
-          <w:sz w:val="22"/>
-          <w:szCs w:val="22"/>
-          <w:rFonts w:eastAsia="宋体" w:ascii="Times New Roman" w:hAnsi="Times New Roman"/>
-        </w:rPr>
-        <w:t xml:space="preserve">3. 蔡元培：《刑事诉讼移送管辖的功能定位与完善路径》，载《中国刑事法杂志》2025年第1期，第89—106页。</w:t>
-      </w:r>
-    </w:p>
-    <w:p>
-      <w:pPr>
-        <w:spacing w:after="120" w:line="360" w:lineRule="auto"/>
-      </w:pPr>
-      <w:r>
-        <w:rPr>
-          <w:sz w:val="22"/>
-          <w:szCs w:val="22"/>
-          <w:rFonts w:eastAsia="宋体" w:ascii="Times New Roman" w:hAnsi="Times New Roman"/>
-        </w:rPr>
-        <w:t xml:space="preserve">4. 卢少锋、秦景琦：《监察调查中指定管辖的问题检视及完善路径》，载《山东警察学院学报》2024年第5期，第52—60页。</w:t>
-      </w:r>
-    </w:p>
-    <w:p>
-      <w:pPr>
-        <w:spacing w:after="120" w:line="360" w:lineRule="auto"/>
-      </w:pPr>
-      <w:r>
-        <w:rPr>
-          <w:sz w:val="22"/>
-          <w:szCs w:val="22"/>
-          <w:rFonts w:eastAsia="宋体" w:ascii="Times New Roman" w:hAnsi="Times New Roman"/>
-        </w:rPr>
-        <w:t xml:space="preserve">5. 陈修勇：《监检衔接视角下职务犯罪指定管辖的实践检讨及程序优化》，载《当代法学》2025年第6期，第115—117页。</w:t>
-      </w:r>
-    </w:p>
-    <w:p>
-      <w:pPr>
-        <w:spacing w:after="120" w:line="360" w:lineRule="auto"/>
-      </w:pPr>
-      <w:r>
-        <w:rPr>
-          <w:sz w:val="22"/>
-          <w:szCs w:val="22"/>
-          <w:rFonts w:eastAsia="宋体" w:ascii="Times New Roman" w:hAnsi="Times New Roman"/>
-        </w:rPr>
-        <w:t xml:space="preserve">6. 徐昕：《论颠覆性程序辩护——以管辖异议的有效利用为例》，载《安徽师范大学学报（人文社会科学版）》2021年第6期，第98—100页。</w:t>
-      </w:r>
-    </w:p>
-    <w:p>
-      <w:pPr>
-        <w:spacing w:after="120" w:line="360" w:lineRule="auto"/>
-      </w:pPr>
-      <w:r>
-        <w:rPr>
-          <w:sz w:val="22"/>
-          <w:szCs w:val="22"/>
-          <w:rFonts w:eastAsia="宋体" w:ascii="Times New Roman" w:hAnsi="Times New Roman"/>
-        </w:rPr>
-        <w:t xml:space="preserve">7. 周涛：《刑事审判管辖异议问题研究》，西南政法大学硕士学位论文，2021年，第3—6页。</w:t>
-      </w:r>
-    </w:p>
-    <w:p>
-      <w:pPr>
-        <w:spacing w:after="120" w:line="360" w:lineRule="auto"/>
-      </w:pPr>
-      <w:r>
-        <w:rPr>
-          <w:sz w:val="22"/>
-          <w:szCs w:val="22"/>
-          <w:rFonts w:eastAsia="宋体" w:ascii="Times New Roman" w:hAnsi="Times New Roman"/>
-        </w:rPr>
-        <w:t xml:space="preserve">8. 蔡元培：《刑事诉讼移送管辖的功能定位与完善路径》，载《中国刑事法杂志》2025年第1期，第91—94页。</w:t>
-      </w:r>
-    </w:p>
-    <w:p>
-      <w:pPr>
-        <w:spacing w:after="120" w:line="360" w:lineRule="auto"/>
-      </w:pPr>
-      <w:r>
-        <w:rPr>
-          <w:sz w:val="22"/>
-          <w:szCs w:val="22"/>
-          <w:rFonts w:eastAsia="宋体" w:ascii="Times New Roman" w:hAnsi="Times New Roman"/>
-        </w:rPr>
-        <w:t xml:space="preserve">9. 李昀遥：《刑事管辖权异议制度研究》，沈阳师范大学硕士学位论文，2024年，第28—34页。</w:t>
-      </w:r>
-    </w:p>
-    <w:p>
-      <w:pPr>
-        <w:spacing w:after="120" w:line="360" w:lineRule="auto"/>
-      </w:pPr>
-      <w:r>
-        <w:rPr>
-          <w:sz w:val="22"/>
-          <w:szCs w:val="22"/>
-          <w:rFonts w:eastAsia="宋体" w:ascii="Times New Roman" w:hAnsi="Times New Roman"/>
-        </w:rPr>
-        <w:t xml:space="preserve">10. 谢小剑：《刑事诉讼法检同级对应地域管辖规则探究》，载《当代法学》2025年第2期。</w:t>
+          <w:rFonts w:eastAsia="宋体" w:ascii="Times New Roman" w:hAnsi="Times New Roman"/>
+          <w:sz w:val="24"/>
+          <w:szCs w:val="24"/>
+        </w:rPr>
+        <w:t xml:space="preserve">[1]: 张培铮：《论公安机关侦查指定管辖》，载《湖南警察学院学报》2022年第5期，第67—68页。</w:t>
+      </w:r>
+    </w:p>
+    <w:p>
+      <w:pPr>
+        <w:spacing w:after="120" w:line="360" w:lineRule="auto"/>
+      </w:pPr>
+      <w:r>
+        <w:rPr>
+          <w:rFonts w:eastAsia="宋体" w:ascii="Times New Roman" w:hAnsi="Times New Roman"/>
+          <w:sz w:val="24"/>
+          <w:szCs w:val="24"/>
+        </w:rPr>
+        <w:t xml:space="preserve">[2]: 郭烁、吴子越：《从“工具导向”到“权利本位”：侦查指定管辖的性质校准》，载《人民检察》2024年第11期，第13—18页。</w:t>
+      </w:r>
+    </w:p>
+    <w:p>
+      <w:pPr>
+        <w:spacing w:after="120" w:line="360" w:lineRule="auto"/>
+      </w:pPr>
+      <w:r>
+        <w:rPr>
+          <w:rFonts w:eastAsia="宋体" w:ascii="Times New Roman" w:hAnsi="Times New Roman"/>
+          <w:sz w:val="24"/>
+          <w:szCs w:val="24"/>
+        </w:rPr>
+        <w:t xml:space="preserve">[3]: 蔡元培：《刑事诉讼移送管辖的功能定位与完善路径》，载《中国刑事法杂志》2025年第1期，第89—106页。</w:t>
+      </w:r>
+    </w:p>
+    <w:p>
+      <w:pPr>
+        <w:spacing w:after="120" w:line="360" w:lineRule="auto"/>
+      </w:pPr>
+      <w:r>
+        <w:rPr>
+          <w:rFonts w:eastAsia="宋体" w:ascii="Times New Roman" w:hAnsi="Times New Roman"/>
+          <w:sz w:val="24"/>
+          <w:szCs w:val="24"/>
+        </w:rPr>
+        <w:t xml:space="preserve">[4]: 卢少锋、秦景琦：《监察调查中指定管辖的问题检视及完善路径》，载《山东警察学院学报》2024年第5期，第52—60页。</w:t>
+      </w:r>
+    </w:p>
+    <w:p>
+      <w:pPr>
+        <w:spacing w:after="120" w:line="360" w:lineRule="auto"/>
+      </w:pPr>
+      <w:r>
+        <w:rPr>
+          <w:rFonts w:eastAsia="宋体" w:ascii="Times New Roman" w:hAnsi="Times New Roman"/>
+          <w:sz w:val="24"/>
+          <w:szCs w:val="24"/>
+        </w:rPr>
+        <w:t xml:space="preserve">[5]: 陈修勇：《监检衔接视角下职务犯罪指定管辖的实践检讨及程序优化》，载《当代法学》2025年第6期，第115—117页。</w:t>
+      </w:r>
+    </w:p>
+    <w:p>
+      <w:pPr>
+        <w:spacing w:after="120" w:line="360" w:lineRule="auto"/>
+      </w:pPr>
+      <w:r>
+        <w:rPr>
+          <w:rFonts w:eastAsia="宋体" w:ascii="Times New Roman" w:hAnsi="Times New Roman"/>
+          <w:sz w:val="24"/>
+          <w:szCs w:val="24"/>
+        </w:rPr>
+        <w:t xml:space="preserve">[6]: 徐昕：《论颠覆性程序辩护——以管辖异议的有效利用为例》，载《安徽师范大学学报（人文社会科学版）》2021年第6期，第98—100页。</w:t>
+      </w:r>
+    </w:p>
+    <w:p>
+      <w:pPr>
+        <w:spacing w:after="120" w:line="360" w:lineRule="auto"/>
+      </w:pPr>
+      <w:r>
+        <w:rPr>
+          <w:rFonts w:eastAsia="宋体" w:ascii="Times New Roman" w:hAnsi="Times New Roman"/>
+          <w:sz w:val="24"/>
+          <w:szCs w:val="24"/>
+        </w:rPr>
+        <w:t xml:space="preserve">[7]: 周涛：《刑事审判管辖异议问题研究》，西南政法大学硕士学位论文，2021年，第3—6页。</w:t>
+      </w:r>
+    </w:p>
+    <w:p>
+      <w:pPr>
+        <w:spacing w:after="120" w:line="360" w:lineRule="auto"/>
+      </w:pPr>
+      <w:r>
+        <w:rPr>
+          <w:rFonts w:eastAsia="宋体" w:ascii="Times New Roman" w:hAnsi="Times New Roman"/>
+          <w:sz w:val="24"/>
+          <w:szCs w:val="24"/>
+        </w:rPr>
+        <w:t xml:space="preserve">[8]: 蔡元培：《刑事诉讼移送管辖的功能定位与完善路径》，载《中国刑事法杂志》2025年第1期，第91—94页。</w:t>
+      </w:r>
+    </w:p>
+    <w:p>
+      <w:pPr>
+        <w:spacing w:after="120" w:line="360" w:lineRule="auto"/>
+      </w:pPr>
+      <w:r>
+        <w:rPr>
+          <w:rFonts w:eastAsia="宋体" w:ascii="Times New Roman" w:hAnsi="Times New Roman"/>
+          <w:sz w:val="24"/>
+          <w:szCs w:val="24"/>
+        </w:rPr>
+        <w:t xml:space="preserve">[9]: 李昀遥：《刑事管辖权异议制度研究》，沈阳师范大学硕士学位论文，2024年，第28—34页。</w:t>
+      </w:r>
+    </w:p>
+    <w:p>
+      <w:pPr>
+        <w:spacing w:after="120" w:line="360" w:lineRule="auto"/>
+      </w:pPr>
+      <w:r>
+        <w:rPr>
+          <w:rFonts w:eastAsia="宋体" w:ascii="Times New Roman" w:hAnsi="Times New Roman"/>
+          <w:sz w:val="24"/>
+          <w:szCs w:val="24"/>
+        </w:rPr>
+        <w:t xml:space="preserve">[10]: 谢小剑：《刑事诉讼法检同级对应地域管辖规则探究》，载《当代法学》2025年第2期。</w:t>
+      </w:r>
+    </w:p>
+    <w:p>
+      <w:pPr>
+        <w:spacing w:after="120" w:line="360" w:lineRule="auto"/>
+      </w:pPr>
+      <w:r>
+        <w:rPr>
+          <w:rFonts w:eastAsia="宋体" w:ascii="Times New Roman" w:hAnsi="Times New Roman"/>
+          <w:sz w:val="24"/>
+          <w:szCs w:val="24"/>
+        </w:rPr>
+        <w:t xml:space="preserve">[11]: 参见周长军、韩晗：《职务犯罪监察调查指定管辖研究》，载《浙江工商大学学报》2023年第3期，第72—75页。该文明确梳理“审判管辖统一说”“维持现状说”“特殊审判管辖说”“异地法官当地审说”，并提出“一般回转当地诉审、例外时原地诉审”的混合型衔接模式。</w:t>
       </w:r>
     </w:p>
     <w:sectPr>

</xml_diff>

<commit_message>
Add sources for procedural control nodes
Co-authored-by: LYX100 <LYX100@users.noreply.github.com>
</commit_message>
<xml_diff>
--- a/陈水桓25级法律（法学）25020070121刑事诉讼法结课论文.docx
+++ b/陈水桓25级法律（法学）25020070121刑事诉讼法结课论文.docx
@@ -642,7 +642,21 @@
           <w:sz w:val="24"/>
           <w:szCs w:val="24"/>
         </w:rPr>
-        <w:t xml:space="preserve">第一个节点是理由公开。指定管辖决定不能只写“情况特殊”“更为适宜”。至少应当说明原管辖机关为什么不适合办理，被指定机关为什么适合办理，案件主要证据、主要犯罪地、被害人所在地等因素如何考虑。这里的公开不一定是向社会完全公开，但至少应当向当事人和辩护人说明。没有理由的指定管辖，本质上很难被审查。</w:t>
+        <w:t xml:space="preserve">这一部分所谓“几个节点”，不是本文凭空提出的制度设计，而是对蔡元培关于移送管辖、李昀遥关于全流程管辖异议、陈修勇关于指定管辖决定书和异议权、谢小剑关于法检同级对应管辖，以及郭烁、吴子越和卢少锋、秦景琦关于管辖错误后果等观点的综合整理。下面的表述加入了我的取舍和评价，但制度来源主要来自这些文献。</w:t>
+      </w:r>
+    </w:p>
+    <w:p>
+      <w:pPr>
+        <w:ind w:firstLineChars="200"/>
+        <w:spacing w:after="120" w:line="360" w:lineRule="auto"/>
+      </w:pPr>
+      <w:r>
+        <w:rPr>
+          <w:rFonts w:eastAsia="宋体" w:ascii="Times New Roman" w:hAnsi="Times New Roman"/>
+          <w:sz w:val="24"/>
+          <w:szCs w:val="24"/>
+        </w:rPr>
+        <w:t xml:space="preserve">第一个节点是理由公开。指定管辖决定不能只写“情况特殊”“更为适宜”。至少应当说明原管辖机关为什么不适合办理，被指定机关为什么适合办理，案件主要证据、主要犯罪地、被害人所在地等因素如何考虑。这里的公开不一定是向社会完全公开，但至少应当向当事人和辩护人说明。陈修勇在讨论职务犯罪指定管辖程序时，就主张指定管辖决定书应载明被指定机关及作出指定管辖的理由，并告知被调查人、犯罪嫌疑人提出异议的时间。[12] 没有理由的指定管辖，本质上很难被审查。</w:t>
       </w:r>
     </w:p>
     <w:p>
@@ -684,35 +698,35 @@
           <w:sz w:val="24"/>
           <w:szCs w:val="24"/>
         </w:rPr>
-        <w:t xml:space="preserve">第四个节点是后果区分。管辖错误不能一概导致程序无效，否则会造成过高的制度成本；但也不能完全没有后果，否则管辖异议就没有意义。比较可行的做法是区分轻重：一般管辖瑕疵，如果没有影响被追诉人权利和案件公正，可以移送后继续使用已经合法取得的证据；如果是明显无管辖权、恶意争抢管辖、借指定管辖规避强制措施条件，则应确认相关程序违法，对违法取得的证据、强制措施和涉案财物处理分别评价。</w:t>
-      </w:r>
-    </w:p>
-    <w:p>
-      <w:pPr>
-        <w:ind w:firstLineChars="200"/>
-        <w:spacing w:after="120" w:line="360" w:lineRule="auto"/>
-      </w:pPr>
-      <w:r>
-        <w:rPr>
-          <w:rFonts w:eastAsia="宋体" w:ascii="Times New Roman" w:hAnsi="Times New Roman"/>
-          <w:sz w:val="24"/>
-          <w:szCs w:val="24"/>
-        </w:rPr>
-        <w:t xml:space="preserve">最后还要强调审判管辖的最终审查。谢小剑提出审查起诉地域管辖应与审判地域管辖相对应，而不能简单由侦查管辖决定。[10] 这个判断放在整个指定管辖制度中同样成立。刑事诉讼最终由法院审判，法院不能只是承接侦查机关或监察机关已经形成的管辖结果。案件到达法院后，法院仍应主动审查本院是否依法具有管辖权；被告人提出异议时，也应作出实质回应，而不是把“已经指定管辖”当成无需审查的理由。</w:t>
-      </w:r>
-    </w:p>
-    <w:p>
-      <w:pPr>
-        <w:ind w:firstLineChars="200"/>
-        <w:spacing w:after="120" w:line="360" w:lineRule="auto"/>
-      </w:pPr>
-      <w:r>
-        <w:rPr>
-          <w:rFonts w:eastAsia="宋体" w:ascii="Times New Roman" w:hAnsi="Times New Roman"/>
-          <w:sz w:val="24"/>
-          <w:szCs w:val="24"/>
-        </w:rPr>
-        <w:t xml:space="preserve">还有一个更棘手的问题：如果管辖确实错误，已经取得的证据和已经作出的强制措施怎么办？这里同样有两种倾向。一种意见主张“原则有效”，认为管辖错误只是机关之间的分工错误，只要证据内容真实、取证方式没有刑讯逼供等严重违法，就不应轻易否定既有程序。这个观点考虑到了诉讼效率，也避免案件因为管辖瑕疵全部推倒重来。另一种意见则强调程序制裁，认为没有管辖权的机关本来就不应启动侦查，其取得的证据、采取的强制措施都存在主体不适格问题，如果不设置无效后果，管辖规则就会变成没有牙齿的规范。</w:t>
+        <w:t xml:space="preserve">第四个节点是后果区分。管辖错误不能一概导致程序无效，否则会造成过高的制度成本；但也不能完全没有后果，否则管辖异议就没有意义。郭烁、吴子越在讨论侦查指定管辖时梳理过有效说、绝对无效说和相对无效说，并倾向于相对无效的处理；卢少锋、秦景琦也在监察调查指定管辖语境中讨论过绝对无效说、相对无效说以及善意、恶意管辖的区分。[13] 本文所谓“后果区分”就是在这些讨论基础上的概括：一般管辖瑕疵，如果没有影响被追诉人权利和案件公正，可以移送后继续使用已经合法取得的证据；如果是明显无管辖权、恶意争抢管辖、借指定管辖规避强制措施条件，则应确认相关程序违法，对违法取得的证据、强制措施和涉案财物处理分别评价。</w:t>
+      </w:r>
+    </w:p>
+    <w:p>
+      <w:pPr>
+        <w:ind w:firstLineChars="200"/>
+        <w:spacing w:after="120" w:line="360" w:lineRule="auto"/>
+      </w:pPr>
+      <w:r>
+        <w:rPr>
+          <w:rFonts w:eastAsia="宋体" w:ascii="Times New Roman" w:hAnsi="Times New Roman"/>
+          <w:sz w:val="24"/>
+          <w:szCs w:val="24"/>
+        </w:rPr>
+        <w:t xml:space="preserve">第五个节点是审判管辖的最终审查。谢小剑提出审查起诉地域管辖应与审判地域管辖相对应，而不能简单由侦查管辖决定。[10] 这个判断放在整个指定管辖制度中同样成立。刑事诉讼最终由法院审判，法院不能只是承接侦查机关或监察机关已经形成的管辖结果。案件到达法院后，法院仍应主动审查本院是否依法具有管辖权；被告人提出异议时，也应作出实质回应，而不是把“已经指定管辖”当成无需审查的理由。</w:t>
+      </w:r>
+    </w:p>
+    <w:p>
+      <w:pPr>
+        <w:ind w:firstLineChars="200"/>
+        <w:spacing w:after="120" w:line="360" w:lineRule="auto"/>
+      </w:pPr>
+      <w:r>
+        <w:rPr>
+          <w:rFonts w:eastAsia="宋体" w:ascii="Times New Roman" w:hAnsi="Times New Roman"/>
+          <w:sz w:val="24"/>
+          <w:szCs w:val="24"/>
+        </w:rPr>
+        <w:t xml:space="preserve">还有一个更棘手的问题：如果管辖确实错误，已经取得的证据和已经作出的强制措施怎么办？这里同样有两种倾向，这一概括主要来自前述关于有效说、绝对无效说、相对无效说的讨论。[13] 一种意见主张“原则有效”，认为管辖错误只是机关之间的分工错误，只要证据内容真实、取证方式没有刑讯逼供等严重违法，就不应轻易否定既有程序。这个观点考虑到了诉讼效率，也避免案件因为管辖瑕疵全部推倒重来。另一种意见则强调程序制裁，认为没有管辖权的机关本来就不应启动侦查，其取得的证据、采取的强制措施都存在主体不适格问题，如果不设置无效后果，管辖规则就会变成没有牙齿的规范。</w:t>
       </w:r>
     </w:p>
     <w:p>
@@ -956,6 +970,32 @@
           <w:szCs w:val="24"/>
         </w:rPr>
         <w:t xml:space="preserve">[11]: 参见周长军、韩晗：《职务犯罪监察调查指定管辖研究》，载《浙江工商大学学报》2023年第3期，第72—75页。该文明确梳理“审判管辖统一说”“维持现状说”“特殊审判管辖说”“异地法官当地审说”，并提出“一般回转当地诉审、例外时原地诉审”的混合型衔接模式。</w:t>
+      </w:r>
+    </w:p>
+    <w:p>
+      <w:pPr>
+        <w:spacing w:after="120" w:line="360" w:lineRule="auto"/>
+      </w:pPr>
+      <w:r>
+        <w:rPr>
+          <w:rFonts w:eastAsia="宋体" w:ascii="Times New Roman" w:hAnsi="Times New Roman"/>
+          <w:sz w:val="24"/>
+          <w:szCs w:val="24"/>
+        </w:rPr>
+        <w:t xml:space="preserve">[12]: 参见陈修勇：《监检衔接视角下职务犯罪指定管辖的实践检讨及程序优化》，载《当代法学》2025年第6期，第122页。该文提出指定管辖决定应载明被指定机关和作出指定管辖的理由，并允许被调查人、犯罪嫌疑人提出异议。</w:t>
+      </w:r>
+    </w:p>
+    <w:p>
+      <w:pPr>
+        <w:spacing w:after="120" w:line="360" w:lineRule="auto"/>
+      </w:pPr>
+      <w:r>
+        <w:rPr>
+          <w:rFonts w:eastAsia="宋体" w:ascii="Times New Roman" w:hAnsi="Times New Roman"/>
+          <w:sz w:val="24"/>
+          <w:szCs w:val="24"/>
+        </w:rPr>
+        <w:t xml:space="preserve">[13]: 参见郭烁、吴子越：《从“工具导向”到“权利本位”：侦查指定管辖的性质校准》，载《人民检察》2024年第11期，第17—18页；卢少锋、秦景琦：《监察调查中指定管辖的问题检视及完善路径》，载《山东警察学院学报》2024年第5期，第58—59页。</w:t>
       </w:r>
     </w:p>
     <w:sectPr>

</xml_diff>

<commit_message>
Add source for rights-based jurisdiction framing
Co-authored-by: LYX100 <LYX100@users.noreply.github.com>
</commit_message>
<xml_diff>
--- a/陈水桓25级法律（法学）25020070121刑事诉讼法结课论文.docx
+++ b/陈水桓25级法律（法学）25020070121刑事诉讼法结课论文.docx
@@ -345,7 +345,7 @@
           <w:sz w:val="24"/>
           <w:szCs w:val="24"/>
         </w:rPr>
-        <w:t xml:space="preserve">这里还存在一个容易被忽略的学说争议：指定管辖究竟是一种权力配置规则，还是一种权利保障规则？如果只把它看成权力配置规则，决定主体自然是上级机关，当事人只需要接受结果；如果承认它具有权利保障功能，当事人就不应被完全排除在程序之外。我的判断是，指定管辖最初也许主要服务于权力配置，但在今天的刑事诉讼中，它已经不可避免地影响被追诉人的受审地点、辩护条件和证据取得，因此必须被重新理解为兼具权力分配和权利保障双重属性的制度。只有承认这种双重属性，后面讨论听取意见、书面说理和管辖异议才不是额外负担，而是制度本身应有的内容。</w:t>
+        <w:t xml:space="preserve">这里还存在一个容易被忽略的学说争议。郭烁、吴子越把侦查指定管辖的问题概括为从“工具导向”向“权利本位”的性质校准，张培铮则提出应通过“权利保障与权力制衡”加强对公安机关侦查指定管辖的监督，周涛也把刑事审判管辖异议理解为基于辩护权产生的诉讼请求。本文据此概括为：指定管辖究竟只是一种权力配置规则，还是同时具有权利保障属性？如果只把它看成权力配置规则，决定主体自然是上级机关，当事人只需要接受结果；如果承认它具有权利保障功能，当事人就不应被完全排除在程序之外。我的判断是，指定管辖最初也许主要服务于权力配置，但在今天的刑事诉讼中，它已经不可避免地影响被追诉人的受审地点、辩护条件和证据取得，因此必须被重新理解为兼具权力分配和权利保障双重属性的制度。只有承认这种双重属性，后面讨论听取意见、书面说理和管辖异议才不是额外负担，而是制度本身应有的内容。[14]</w:t>
       </w:r>
     </w:p>
     <w:p>
@@ -996,6 +996,19 @@
           <w:szCs w:val="24"/>
         </w:rPr>
         <w:t xml:space="preserve">[13]: 参见郭烁、吴子越：《从“工具导向”到“权利本位”：侦查指定管辖的性质校准》，载《人民检察》2024年第11期，第17—18页；卢少锋、秦景琦：《监察调查中指定管辖的问题检视及完善路径》，载《山东警察学院学报》2024年第5期，第58—59页。</w:t>
+      </w:r>
+    </w:p>
+    <w:p>
+      <w:pPr>
+        <w:spacing w:after="120" w:line="360" w:lineRule="auto"/>
+      </w:pPr>
+      <w:r>
+        <w:rPr>
+          <w:rFonts w:eastAsia="宋体" w:ascii="Times New Roman" w:hAnsi="Times New Roman"/>
+          <w:sz w:val="24"/>
+          <w:szCs w:val="24"/>
+        </w:rPr>
+        <w:t xml:space="preserve">[14]: 参见郭烁、吴子越：《从“工具导向”到“权利本位”：侦查指定管辖的性质校准》，载《人民检察》2024年第11期，第13—18页；张培铮：《论公安机关侦查指定管辖》，载《湖南警察学院学报》2022年第5期，第76—77页；周涛：《刑事审判管辖异议问题研究》，西南政法大学硕士学位论文，2021年，第3—6页。</w:t>
       </w:r>
     </w:p>
     <w:sectPr>

</xml_diff>

<commit_message>
Add sources for efficiency and rights views
Co-authored-by: LYX100 <LYX100@users.noreply.github.com>
</commit_message>
<xml_diff>
--- a/陈水桓25级法律（法学）25020070121刑事诉讼法结课论文.docx
+++ b/陈水桓25级法律（法学）25020070121刑事诉讼法结课论文.docx
@@ -275,7 +275,7 @@
           <w:sz w:val="24"/>
           <w:szCs w:val="24"/>
         </w:rPr>
-        <w:t xml:space="preserve">一种观点偏重效率，认为刑事犯罪形态越来越复杂，网络犯罪、经济犯罪、职务犯罪经常跨地区发生，如果仍然拘泥于传统地域管辖规则，案件办理会非常困难。按照这一看法，指定管辖是一种灵活工具，可以快速解决管辖冲突，排除地方阻力，也能集中办案力量。这个观点有现实基础。比如跨区域电信诈骗案件中，犯罪行为地、被害人所在地、资金流转地可能分散在多个地方，如果所有机关都等待别人先办，追诉活动可能难以展开。</w:t>
+        <w:t xml:space="preserve">一种观点偏重效率，认为刑事犯罪形态越来越复杂，网络犯罪、经济犯罪、职务犯罪经常跨地区发生，如果仍然拘泥于传统地域管辖规则，案件办理会非常困难。按照这一看法，指定管辖是一种灵活工具，可以快速解决管辖冲突，排除地方阻力，也能集中办案力量。这个观点有现实基础。比如跨区域电信诈骗案件中，犯罪行为地、被害人所在地、资金流转地可能分散在多个地方，如果所有机关都等待别人先办，追诉活动可能难以展开。[15]</w:t>
       </w:r>
     </w:p>
     <w:p>
@@ -303,7 +303,7 @@
           <w:sz w:val="24"/>
           <w:szCs w:val="24"/>
         </w:rPr>
-        <w:t xml:space="preserve">另一种观点偏重权利保障，强调法定法官原则和管辖确定性，认为指定管辖是一种“人定法官”，应当尽可能压缩。这个观点提醒我们，管辖不能完全由机关事后选择，否则容易出现选择性办案。但是，如果过度强调确定性，又可能忽视我国刑事案件的复杂现实。有些案件确实存在本地机关整体不宜办理的问题。例如地方领导干部职务犯罪案件，如果被调查人在当地长期任职，案件仍由当地机关办理，社会公众很难相信程序完全不受影响。此时若完全排除指定管辖，反而不利于公正。</w:t>
+        <w:t xml:space="preserve">另一种观点偏重权利保障，强调法定法官原则和管辖确定性，认为指定管辖是一种“人定法官”，应当尽可能压缩。这个观点提醒我们，管辖不能完全由机关事后选择，否则容易出现选择性办案。但是，如果过度强调确定性，又可能忽视我国刑事案件的复杂现实。有些案件确实存在本地机关整体不宜办理的问题。例如地方领导干部职务犯罪案件，如果被调查人在当地长期任职，案件仍由当地机关办理，社会公众很难相信程序完全不受影响。此时若完全排除指定管辖，反而不利于公正。[16]</w:t>
       </w:r>
     </w:p>
     <w:p>
@@ -1009,6 +1009,32 @@
           <w:szCs w:val="24"/>
         </w:rPr>
         <w:t xml:space="preserve">[14]: 参见郭烁、吴子越：《从“工具导向”到“权利本位”：侦查指定管辖的性质校准》，载《人民检察》2024年第11期，第13—18页；张培铮：《论公安机关侦查指定管辖》，载《湖南警察学院学报》2022年第5期，第76—77页；周涛：《刑事审判管辖异议问题研究》，西南政法大学硕士学位论文，2021年，第3—6页。</w:t>
+      </w:r>
+    </w:p>
+    <w:p>
+      <w:pPr>
+        <w:spacing w:after="120" w:line="360" w:lineRule="auto"/>
+      </w:pPr>
+      <w:r>
+        <w:rPr>
+          <w:rFonts w:eastAsia="宋体" w:ascii="Times New Roman" w:hAnsi="Times New Roman"/>
+          <w:sz w:val="24"/>
+          <w:szCs w:val="24"/>
+        </w:rPr>
+        <w:t xml:space="preserve">[15]: 参见张培铮：《论公安机关侦查指定管辖》，载《湖南警察学院学报》2022年第5期，第68—70页；郭烁、吴子越：《从“工具导向”到“权利本位”：侦查指定管辖的性质校准》，载《人民检察》2024年第11期，第15—16页；陈修勇：《监检衔接视角下职务犯罪指定管辖的实践检讨及程序优化》，载《当代法学》2025年第6期，第115—116页。</w:t>
+      </w:r>
+    </w:p>
+    <w:p>
+      <w:pPr>
+        <w:spacing w:after="120" w:line="360" w:lineRule="auto"/>
+      </w:pPr>
+      <w:r>
+        <w:rPr>
+          <w:rFonts w:eastAsia="宋体" w:ascii="Times New Roman" w:hAnsi="Times New Roman"/>
+          <w:sz w:val="24"/>
+          <w:szCs w:val="24"/>
+        </w:rPr>
+        <w:t xml:space="preserve">[16]: 参见郭烁：《法定法官原则：刑事管辖制度的确定性与救济性》，载《北京联合大学学报（人文社会科学版）》2024年第3期，第41—48页；陈修勇：《监检衔接视角下职务犯罪指定管辖的实践检讨及程序优化》，载《当代法学》2025年第6期，第115页；张培铮：《论公安机关侦查指定管辖》，载《湖南警察学院学报》2022年第5期，第73—75页。</w:t>
       </w:r>
     </w:p>
     <w:sectPr>

</xml_diff>